<commit_message>
Pillar tools: word counter v2, readability, headline and blog generator widgets; fix pillar word counter URL
Co-Authored-By: Claude Opus 5.5 <noreply@anthropic.com>
Claude-Session: https://claude.ai/code/session_01GQXcnZLn4f9MkUS7SEqp5J
</commit_message>
<xml_diff>
--- a/blog-content/AI-Content-Writing-Complete-Guide-PILLAR.docx
+++ b/blog-content/AI-Content-Writing-Complete-Guide-PILLAR.docx
@@ -1080,7 +1080,7 @@
         </w:rPr>
         <w:t xml:space="preserve"> Give the AI your outline and your facts, then draft one section at a time. Whole-article prompts produce the most generic results. The </w:t>
       </w:r>
-      <w:hyperlink w:history="1" r:id="rIddrslnaaj3pdcqovzaxex0">
+      <w:hyperlink w:history="1" r:id="rId2j8fhyifacy219h2_mhlr">
         <w:r>
           <w:rPr>
             <w:rStyle w:val="Hyperlink"/>
@@ -1230,7 +1230,7 @@
         </w:rPr>
         <w:t xml:space="preserve">For a business, this becomes a question of which jobs to hand over and how much time to budget. </w:t>
       </w:r>
-      <w:hyperlink w:history="1" r:id="rId8a-ejsav62gjd4yg6ylif">
+      <w:hyperlink w:history="1" r:id="rIdinou353wjsojdf0x3t-dd">
         <w:r>
           <w:rPr>
             <w:rStyle w:val="Hyperlink"/>
@@ -1311,7 +1311,7 @@
         </w:rPr>
         <w:t xml:space="preserve">That's why the most useful question isn't whether to use AI, but where in the process a person adds value. I compare the two approaches in detail, including cost, quality and when to choose each, in </w:t>
       </w:r>
-      <w:hyperlink w:history="1" r:id="rIdmwplw7hmq0als0prvvf38">
+      <w:hyperlink w:history="1" r:id="rId0x4ynodzj00rrcikuyvue">
         <w:r>
           <w:rPr>
             <w:rStyle w:val="Hyperlink"/>
@@ -1728,7 +1728,7 @@
         </w:rPr>
         <w:t xml:space="preserve">If you're choosing for the first time, </w:t>
       </w:r>
-      <w:hyperlink w:history="1" r:id="rId8q6iomtwisdnmr9x2xfen">
+      <w:hyperlink w:history="1" r:id="rId-tbmu3mbcbbguvx304nrm">
         <w:r>
           <w:rPr>
             <w:rStyle w:val="Hyperlink"/>
@@ -1975,7 +1975,7 @@
         </w:rPr>
         <w:t xml:space="preserve"> Let AI write section by section from your outline and facts, not the whole article from one prompt. The </w:t>
       </w:r>
-      <w:hyperlink w:history="1" r:id="rIdmcaperc774z-vul_oivt2">
+      <w:hyperlink w:history="1" r:id="rIdiqvuhhvydo9wnjemc0aht">
         <w:r>
           <w:rPr>
             <w:rStyle w:val="Hyperlink"/>
@@ -2031,7 +2031,7 @@
         </w:rPr>
         <w:t xml:space="preserve"> Remove filler, add first-hand examples, vary sentence rhythm and check every claim. </w:t>
       </w:r>
-      <w:hyperlink w:history="1" r:id="rId8fwth6mqrhvcpws50v-7k">
+      <w:hyperlink w:history="1" r:id="rIdetbay5blf2yevaxfz6wz2">
         <w:r>
           <w:rPr>
             <w:rStyle w:val="Hyperlink"/>
@@ -2053,7 +2053,7 @@
         </w:rPr>
         <w:t xml:space="preserve"> covers the editing techniques. If you're reworking existing text, know the difference between </w:t>
       </w:r>
-      <w:hyperlink w:history="1" r:id="rIdajclz6lwt7gorpivgfjj7">
+      <w:hyperlink w:history="1" r:id="rIdw_1cfx0_jiuvsfhih07h_">
         <w:r>
           <w:rPr>
             <w:rStyle w:val="Hyperlink"/>
@@ -2109,7 +2109,7 @@
         </w:rPr>
         <w:t xml:space="preserve"> Write a title that earns the click (</w:t>
       </w:r>
-      <w:hyperlink w:history="1" r:id="rIdhmjrgieufann6lysshpey">
+      <w:hyperlink w:history="1" r:id="rIdkghojwahkaw7nqc-_xnys">
         <w:r>
           <w:rPr>
             <w:rStyle w:val="Hyperlink"/>
@@ -2131,7 +2131,7 @@
         </w:rPr>
         <w:t xml:space="preserve">), check the text is easy to read (</w:t>
       </w:r>
-      <w:hyperlink w:history="1" r:id="rIdj03en19zyqrk4ujtsh16d">
+      <w:hyperlink w:history="1" r:id="rIdricbefn5svno-1irzmrmf">
         <w:r>
           <w:rPr>
             <w:rStyle w:val="Hyperlink"/>
@@ -2153,7 +2153,7 @@
         </w:rPr>
         <w:t xml:space="preserve">) and make sure the length fits the topic (</w:t>
       </w:r>
-      <w:hyperlink w:history="1" r:id="rIdyjrzanaj40xwmvp4lasfx">
+      <w:hyperlink w:history="1" r:id="rIdvu-fqhnuybltilsqqd6an">
         <w:r>
           <w:rPr>
             <w:rStyle w:val="Hyperlink"/>
@@ -2705,7 +2705,7 @@
         </w:rPr>
         <w:t xml:space="preserve">The largest public test of this is Ahrefs' July 2025 study of 600,000 top-ranking pages, which found </w:t>
       </w:r>
-      <w:hyperlink w:history="1" r:id="rIdsabukq5_gs2uhbvahrgfe">
+      <w:hyperlink w:history="1" r:id="rIdupwvb0uyeki-zpje5xkld">
         <w:r>
           <w:rPr>
             <w:rStyle w:val="Hyperlink"/>
@@ -2799,7 +2799,7 @@
         </w:rPr>
         <w:t xml:space="preserve"> Google's 2026 guidance on AI features warns against </w:t>
       </w:r>
-      <w:hyperlink w:history="1" r:id="rIdmqkz8398raqeqlbv213w-">
+      <w:hyperlink w:history="1" r:id="rIdvqnkf-vecbdrswotywevg">
         <w:r>
           <w:rPr>
             <w:rStyle w:val="Hyperlink"/>
@@ -2893,7 +2893,7 @@
         </w:rPr>
         <w:t xml:space="preserve">AI search follows the same rules. Google says there are </w:t>
       </w:r>
-      <w:hyperlink w:history="1" r:id="rIdd-mtqbwyob_aeyzbnptfw">
+      <w:hyperlink w:history="1" r:id="rIduoknqws7n73w6unbiik8a">
         <w:r>
           <w:rPr>
             <w:rStyle w:val="Hyperlink"/>
@@ -2946,7 +2946,7 @@
         </w:rPr>
         <w:t xml:space="preserve">AI content is not against Google's policies, and Google does not rank pages on whether AI wrote them. Google's </w:t>
       </w:r>
-      <w:hyperlink w:history="1" r:id="rIdjihmmeq7iyracl60khmms">
+      <w:hyperlink w:history="1" r:id="rIda5lqiwn2wqom9kdw2ic6z">
         <w:r>
           <w:rPr>
             <w:rStyle w:val="Hyperlink"/>
@@ -2982,7 +2982,7 @@
         </w:rPr>
         <w:t xml:space="preserve">That rule is called scaled content abuse, and it's defined in Google's </w:t>
       </w:r>
-      <w:hyperlink w:history="1" r:id="rId7nqnrznm_5wiji-9brw-a">
+      <w:hyperlink w:history="1" r:id="rIdwfu-khmml5hwwnwmifvmf">
         <w:r>
           <w:rPr>
             <w:rStyle w:val="Hyperlink"/>
@@ -3018,7 +3018,7 @@
         </w:rPr>
         <w:t xml:space="preserve">Whether Google can technically detect AI text is a separate and more complicated question. It involves watermarks, spam systems and the limits of AI detectors, and I tested detectors myself to find out how reliable they are. That's all covered in </w:t>
       </w:r>
-      <w:hyperlink w:history="1" r:id="rIdprfxsxcsxsrxbickgjdtd">
+      <w:hyperlink w:history="1" r:id="rIdbetjkzzi-juzkglxazpmy">
         <w:r>
           <w:rPr>
             <w:rStyle w:val="Hyperlink"/>
@@ -3091,7 +3091,7 @@
         </w:rPr>
         <w:t xml:space="preserve"> AI states made-up details with confidence. The problem is visible even in academic publishing: a 2026 study in The Lancet found fabricated references in </w:t>
       </w:r>
-      <w:hyperlink w:history="1" r:id="rIdfcixqhayqj4nkzbck4hh6">
+      <w:hyperlink w:history="1" r:id="rIdhle3vhgd8cgmdm-b8ttxe">
         <w:r>
           <w:rPr>
             <w:rStyle w:val="Hyperlink"/>
@@ -3561,7 +3561,7 @@
           <w:numId w:val="1"/>
         </w:numPr>
       </w:pPr>
-      <w:hyperlink w:history="1" r:id="rIdn2oq8rxtj2xnezrfchkj3">
+      <w:hyperlink w:history="1" r:id="rIdq0aqetlit_zttqg61yjsv">
         <w:r>
           <w:rPr>
             <w:rStyle w:val="Hyperlink"/>
@@ -3592,7 +3592,7 @@
           <w:numId w:val="1"/>
         </w:numPr>
       </w:pPr>
-      <w:hyperlink w:history="1" r:id="rIdx4086bbxjxelggtnxipsh">
+      <w:hyperlink w:history="1" r:id="rIdpj5okkkxsjh9b6hpwn0jl">
         <w:r>
           <w:rPr>
             <w:rStyle w:val="Hyperlink"/>
@@ -3623,7 +3623,7 @@
           <w:numId w:val="1"/>
         </w:numPr>
       </w:pPr>
-      <w:hyperlink w:history="1" r:id="rIdusaucpoo-kiwdurmegxpt">
+      <w:hyperlink w:history="1" r:id="rId1ajnnmhfithpnk23w26ic">
         <w:r>
           <w:rPr>
             <w:rStyle w:val="Hyperlink"/>
@@ -3654,7 +3654,7 @@
           <w:numId w:val="1"/>
         </w:numPr>
       </w:pPr>
-      <w:hyperlink w:history="1" r:id="rIdlmgg_gh0vphf7ggueauyy">
+      <w:hyperlink w:history="1" r:id="rId8cixe1q6p2pgtx8vuurpq">
         <w:r>
           <w:rPr>
             <w:rStyle w:val="Hyperlink"/>
@@ -3685,7 +3685,7 @@
           <w:numId w:val="1"/>
         </w:numPr>
       </w:pPr>
-      <w:hyperlink w:history="1" r:id="rIdighoomwobrgioa8y6ygk8">
+      <w:hyperlink w:history="1" r:id="rIdliqnvgbuagxcknhw63g-q">
         <w:r>
           <w:rPr>
             <w:rStyle w:val="Hyperlink"/>
@@ -3716,7 +3716,7 @@
           <w:numId w:val="1"/>
         </w:numPr>
       </w:pPr>
-      <w:hyperlink w:history="1" r:id="rIdmhhmqir4bhutazuh1ovdp">
+      <w:hyperlink w:history="1" r:id="rIdixkesxg-3g5owbbbogsxh">
         <w:r>
           <w:rPr>
             <w:rStyle w:val="Hyperlink"/>
@@ -3752,7 +3752,7 @@
         </w:rPr>
         <w:t xml:space="preserve">If you'd rather have the writing done for you, our </w:t>
       </w:r>
-      <w:hyperlink w:history="1" r:id="rId_fnrzvoj-uvwnykt1rcl3">
+      <w:hyperlink w:history="1" r:id="rIdputqfioezliuzziszzsj7">
         <w:r>
           <w:rPr>
             <w:rStyle w:val="Hyperlink"/>
@@ -3960,7 +3960,7 @@
         </w:rPr>
         <w:t xml:space="preserve">Start with the part of the process you need most: the </w:t>
       </w:r>
-      <w:hyperlink w:history="1" r:id="rIdfkpqo4kmuge0bw9fkw4qb">
+      <w:hyperlink w:history="1" r:id="rIdrlslfuxrm5zpbnesojbgg">
         <w:r>
           <w:rPr>
             <w:rStyle w:val="Hyperlink"/>
@@ -3982,7 +3982,7 @@
         </w:rPr>
         <w:t xml:space="preserve"> if you're new, the </w:t>
       </w:r>
-      <w:hyperlink w:history="1" r:id="rIdsw2gow5mwo3qw7durnye6">
+      <w:hyperlink w:history="1" r:id="rIdmbf7mifjus_9kldh1rhdc">
         <w:r>
           <w:rPr>
             <w:rStyle w:val="Hyperlink"/>
@@ -4004,7 +4004,7 @@
         </w:rPr>
         <w:t xml:space="preserve"> if your drafts sound robotic, or </w:t>
       </w:r>
-      <w:hyperlink w:history="1" r:id="rIdp1ye9-kqnlxiefcd9m2ej">
+      <w:hyperlink w:history="1" r:id="rId_vo9_pvfj0ekvq3zgwtnh">
         <w:r>
           <w:rPr>
             <w:rStyle w:val="Hyperlink"/>

</xml_diff>

<commit_message>
Pillar audit: verified citations, Search Console AI control, disclosure rules, copyright, new unique FAQs
Co-Authored-By: Claude Opus 5.5 <noreply@anthropic.com>
Claude-Session: https://claude.ai/code/session_01GQXcnZLn4f9MkUS7SEqp5J
</commit_message>
<xml_diff>
--- a/blog-content/AI-Content-Writing-Complete-Guide-PILLAR.docx
+++ b/blog-content/AI-Content-Writing-Complete-Guide-PILLAR.docx
@@ -15,7 +15,7 @@
           <w:sz w:val="18"/>
           <w:szCs w:val="18"/>
         </w:rPr>
-        <w:t xml:space="preserve">PILLAR PAGE: AI Content Writing: The Complete Guide for 2026 | BrightlyFuture.co.uk | URL: /blog/ai-content-writing-guide/ | Meta Description: The complete guide to AI content writing in 2026: what AI does well, the tools, a 7-stage workflow, SEO and Google rules, risks and 10 in-depth guides. | Primary Keyword: ai content writing complete guide</w:t>
+        <w:t xml:space="preserve">PILLAR PAGE: AI Content Writing: The Complete Guide for 2026 | BrightlyFuture.co.uk | URL: /blog/ai-content-writing-guide/ | Meta Description: AI content writing explained for 2026: what AI does well, the best tools, a 7-stage workflow, what Google rewards, disclosure rules and the risks. | Primary Keyword: ai content writing complete guide</w:t>
       </w:r>
     </w:p>
     <w:p>
@@ -65,7 +65,7 @@
           <w:sz w:val="24"/>
           <w:szCs w:val="24"/>
         </w:rPr>
-        <w:t xml:space="preserve"> AI content writing means using tools like Claude, ChatGPT or Jasper to research, outline and draft content that a person then edits, fact-checks and publishes. Done well, it ranks: Google judges usefulness, not authorship. Done badly, it produces generic, error-prone pages that neither readers nor Google reward.</w:t>
+        <w:t xml:space="preserve"> AI content writing means using tools like Claude, ChatGPT or Gemini to research, outline and draft content that a person then edits, fact-checks and publishes. Google ranks it on usefulness, not authorship, so reviewed AI content can rank well. Unreviewed AI content produces generic, error-prone pages that rarely do.</w:t>
       </w:r>
     </w:p>
     <w:p>
@@ -137,21 +137,21 @@
           <w:sz w:val="24"/>
           <w:szCs w:val="24"/>
         </w:rPr>
-        <w:t xml:space="preserve">Every article on this site starts as an AI draft. I use Claude, give it detailed instructions about the business, and then spend most of my time on the parts it can't do: testing, checking sources and adding what I've seen first-hand. That process took our Search Console clicks from 77 in the first month to 164 in the second and 970 in the third.</w:t>
-      </w:r>
-    </w:p>
-    <w:p>
-      <w:pPr>
-        <w:spacing w:after="160"/>
-      </w:pPr>
-      <w:r>
-        <w:rPr>
-          <w:rFonts w:ascii="Calibri" w:cs="Calibri" w:eastAsia="Calibri" w:hAnsi="Calibri"/>
-          <w:color w:val="333333"/>
-          <w:sz w:val="24"/>
-          <w:szCs w:val="24"/>
-        </w:rPr>
-        <w:t xml:space="preserve">This guide is the map of that process. It explains what AI content writing is, what it does well and badly, which tools matter, how the workflow fits together and what Google actually rewards. Each section gives you the essentials, then points to a dedicated guide when you want the full detail.</w:t>
+        <w:t xml:space="preserve">Every article on this site starts as an AI draft. I use Claude, set up with detailed instructions about the business, and then spend most of my time on what it can't do: testing, checking sources and adding what I've seen first-hand. On one site where I used this exact process, Search Console clicks went from 77 in the first month to 164 in the second and 970 in the third.</w:t>
+      </w:r>
+    </w:p>
+    <w:p>
+      <w:pPr>
+        <w:spacing w:after="160"/>
+      </w:pPr>
+      <w:r>
+        <w:rPr>
+          <w:rFonts w:ascii="Calibri" w:cs="Calibri" w:eastAsia="Calibri" w:hAnsi="Calibri"/>
+          <w:color w:val="333333"/>
+          <w:sz w:val="24"/>
+          <w:szCs w:val="24"/>
+        </w:rPr>
+        <w:t xml:space="preserve">This guide is the map of that process: what AI content writing is, what it does well and badly, which tools matter, how the workflow fits together, what Google rewards and the rules you need to know in 2026. Each section gives you the essentials, then points to a dedicated guide when you want the full detail.</w:t>
       </w:r>
     </w:p>
     <w:p>
@@ -311,7 +311,25 @@
           <w:sz w:val="24"/>
           <w:szCs w:val="24"/>
         </w:rPr>
-        <w:t xml:space="preserve">Can Google detect AI content, and is it against Google's policies?</w:t>
+        <w:t xml:space="preserve">Is AI content against Google's policies, and can Google detect it?</w:t>
+      </w:r>
+    </w:p>
+    <w:p>
+      <w:pPr>
+        <w:pStyle w:val="ListParagraph"/>
+        <w:numPr>
+          <w:ilvl w:val="0"/>
+          <w:numId w:val="1"/>
+        </w:numPr>
+      </w:pPr>
+      <w:r>
+        <w:rPr>
+          <w:rFonts w:ascii="Calibri" w:cs="Calibri" w:eastAsia="Calibri" w:hAnsi="Calibri"/>
+          <w:color w:val="333333"/>
+          <w:sz w:val="24"/>
+          <w:szCs w:val="24"/>
+        </w:rPr>
+        <w:t xml:space="preserve">Do you have to disclose that you used AI?</w:t>
       </w:r>
     </w:p>
     <w:p>
@@ -468,7 +486,7 @@
           <w:sz w:val="24"/>
           <w:szCs w:val="24"/>
         </w:rPr>
-        <w:t xml:space="preserve">A large language model (LLM) works by predicting the most likely next word, one word at a time, based on patterns in the enormous amount of text it was trained on. That explains both its strengths and its weaknesses:</w:t>
+        <w:t xml:space="preserve">A large language model (LLM) works by predicting the most likely next word, one word at a time, based on patterns in the huge amount of text it was trained on. That explains both its strengths and its weaknesses:</w:t>
       </w:r>
     </w:p>
     <w:p>
@@ -497,7 +515,7 @@
           <w:sz w:val="24"/>
           <w:szCs w:val="24"/>
         </w:rPr>
-        <w:t xml:space="preserve"> it has seen millions of examples of well-formed sentences, headings and explanations, so it produces clean prose almost instantly.</w:t>
+        <w:t xml:space="preserve"> it has seen millions of well-formed sentences, headings and explanations, so it produces clean prose almost instantly.</w:t>
       </w:r>
     </w:p>
     <w:p>
@@ -560,16 +578,81 @@
     </w:p>
     <w:p>
       <w:pPr>
-        <w:spacing w:after="160"/>
-      </w:pPr>
-      <w:r>
-        <w:rPr>
-          <w:rFonts w:ascii="Calibri" w:cs="Calibri" w:eastAsia="Calibri" w:hAnsi="Calibri"/>
-          <w:color w:val="333333"/>
-          <w:sz w:val="24"/>
-          <w:szCs w:val="24"/>
-        </w:rPr>
-        <w:t xml:space="preserve">Most people now use AI content writing in one of three ways. Some use it as an assistant for ideas, outlines and editing. Others use it as a co-writer that drafts while they add expertise and check facts. A few use it as an autopilot that publishes with little review. The first two can produce excellent content. The third is where most of the problems described in this guide come from.</w:t>
+        <w:pStyle w:val="ListParagraph"/>
+        <w:numPr>
+          <w:ilvl w:val="0"/>
+          <w:numId w:val="1"/>
+        </w:numPr>
+      </w:pPr>
+      <w:r>
+        <w:rPr>
+          <w:rFonts w:ascii="Calibri" w:cs="Calibri" w:eastAsia="Calibri" w:hAnsi="Calibri"/>
+          <w:b/>
+          <w:bCs/>
+          <w:color w:val="333333"/>
+          <w:sz w:val="24"/>
+          <w:szCs w:val="24"/>
+        </w:rPr>
+        <w:t xml:space="preserve">Why your sources help:</w:t>
+      </w:r>
+      <w:r>
+        <w:rPr>
+          <w:rFonts w:ascii="Calibri" w:cs="Calibri" w:eastAsia="Calibri" w:hAnsi="Calibri"/>
+          <w:color w:val="333333"/>
+          <w:sz w:val="24"/>
+          <w:szCs w:val="24"/>
+        </w:rPr>
+        <w:t xml:space="preserve"> when you give it your own notes, documents or pasted research to work from (called grounding), it has real material to use instead of guessing.</w:t>
+      </w:r>
+    </w:p>
+    <w:p>
+      <w:pPr>
+        <w:spacing w:after="160"/>
+      </w:pPr>
+      <w:r>
+        <w:rPr>
+          <w:rFonts w:ascii="Calibri" w:cs="Calibri" w:eastAsia="Calibri" w:hAnsi="Calibri"/>
+          <w:color w:val="333333"/>
+          <w:sz w:val="24"/>
+          <w:szCs w:val="24"/>
+        </w:rPr>
+        <w:t xml:space="preserve">Almost everyone now uses it. Orbit Media's 2026 survey of 1,042 content marketers found that </w:t>
+      </w:r>
+      <w:hyperlink w:history="1" r:id="rIdiyyu9r7rpberwarvmoxng">
+        <w:r>
+          <w:rPr>
+            <w:rStyle w:val="Hyperlink"/>
+            <w:rFonts w:ascii="Calibri" w:cs="Calibri" w:eastAsia="Calibri" w:hAnsi="Calibri"/>
+            <w:color w:val="0563C1"/>
+            <w:sz w:val="24"/>
+            <w:szCs w:val="24"/>
+            <w:u w:val="single"/>
+          </w:rPr>
+          <w:t xml:space="preserve">92.4% use AI for blogging</w:t>
+        </w:r>
+      </w:hyperlink>
+      <w:r>
+        <w:rPr>
+          <w:rFonts w:ascii="Calibri" w:cs="Calibri" w:eastAsia="Calibri" w:hAnsi="Calibri"/>
+          <w:color w:val="333333"/>
+          <w:sz w:val="24"/>
+          <w:szCs w:val="24"/>
+        </w:rPr>
+        <w:t xml:space="preserve">, but only 17% use it to write complete drafts. The same survey found that using AI does not, on its own, improve content performance. How you use it decides the result.</w:t>
+      </w:r>
+    </w:p>
+    <w:p>
+      <w:pPr>
+        <w:spacing w:after="160"/>
+      </w:pPr>
+      <w:r>
+        <w:rPr>
+          <w:rFonts w:ascii="Calibri" w:cs="Calibri" w:eastAsia="Calibri" w:hAnsi="Calibri"/>
+          <w:color w:val="333333"/>
+          <w:sz w:val="24"/>
+          <w:szCs w:val="24"/>
+        </w:rPr>
+        <w:t xml:space="preserve">People tend to use it in one of three ways. Some treat it as an assistant for ideas, outlines and editing. Others use it as a co-writer that drafts while they add expertise and check facts. A few use it as an autopilot that publishes with little review. The first two can produce excellent content. The third is where most of the problems in this guide come from.</w:t>
       </w:r>
     </w:p>
     <w:p>
@@ -782,7 +865,7 @@
                 <w:sz w:val="24"/>
                 <w:szCs w:val="24"/>
               </w:rPr>
-              <w:t xml:space="preserve">Angle, first-hand examples, fact-checks</w:t>
+              <w:t xml:space="preserve">Angle, your own examples, fact-checks</w:t>
             </w:r>
           </w:p>
         </w:tc>
@@ -916,7 +999,7 @@
                 <w:sz w:val="24"/>
                 <w:szCs w:val="24"/>
               </w:rPr>
-              <w:t xml:space="preserve">Clear, consistent descriptions at scale</w:t>
+              <w:t xml:space="preserve">Clear, uniform descriptions at scale</w:t>
             </w:r>
           </w:p>
         </w:tc>
@@ -1080,7 +1163,7 @@
         </w:rPr>
         <w:t xml:space="preserve"> Give the AI your outline and your facts, then draft one section at a time. Whole-article prompts produce the most generic results. The </w:t>
       </w:r>
-      <w:hyperlink w:history="1" r:id="rId2j8fhyifacy219h2_mhlr">
+      <w:hyperlink w:history="1" r:id="rId9y3e4w8zrbpbjlaxonmgd">
         <w:r>
           <w:rPr>
             <w:rStyle w:val="Hyperlink"/>
@@ -1125,7 +1208,7 @@
           <w:sz w:val="24"/>
           <w:szCs w:val="24"/>
         </w:rPr>
-        <w:t xml:space="preserve"> Ask for five subject lines and pick one yourself. Keep the body short, write the offer in your own words, and make sure the sign-off sounds like a person, because readers notice when a newsletter stops sounding like you.</w:t>
+        <w:t xml:space="preserve"> Ask for five subject lines and pick one yourself. Keep the body short, write the offer in your own words, and make the sign-off sound like a person, because readers notice when a newsletter stops sounding like you.</w:t>
       </w:r>
     </w:p>
     <w:p>
@@ -1150,7 +1233,7 @@
           <w:sz w:val="24"/>
           <w:szCs w:val="24"/>
         </w:rPr>
-        <w:t xml:space="preserve"> AI is at its most useful here as a repurposing tool. Paste in a finished article and ask for three captions for different platforms, then add your own photo and cut anything that sounds like an advert.</w:t>
+        <w:t xml:space="preserve"> AI is most useful here for repurposing. Paste in a finished article, ask for three captions for different platforms, then add your own photo and cut anything that sounds like an advert.</w:t>
       </w:r>
     </w:p>
     <w:p>
@@ -1175,7 +1258,7 @@
           <w:sz w:val="24"/>
           <w:szCs w:val="24"/>
         </w:rPr>
-        <w:t xml:space="preserve"> Give the AI a fixed template and the real specifications for each product. It's excellent at producing consistent descriptions across a catalogue, and poor at knowing whether a size, material or price is correct, so check every figure.</w:t>
+        <w:t xml:space="preserve"> Give the AI a fixed template and the real specifications for each product. It's good at producing descriptions that match across a catalogue, and poor at knowing whether a size, material or price is correct, so check every figure.</w:t>
       </w:r>
     </w:p>
     <w:p>
@@ -1200,21 +1283,21 @@
           <w:sz w:val="24"/>
           <w:szCs w:val="24"/>
         </w:rPr>
-        <w:t xml:space="preserve"> Use AI to generate headline and copy variations for testing, not to decide what you promise. Every claim on an ad or landing page needs to be one you can prove.</w:t>
-      </w:r>
-    </w:p>
-    <w:p>
-      <w:pPr>
-        <w:spacing w:after="160"/>
-      </w:pPr>
-      <w:r>
-        <w:rPr>
-          <w:rFonts w:ascii="Calibri" w:cs="Calibri" w:eastAsia="Calibri" w:hAnsi="Calibri"/>
-          <w:color w:val="333333"/>
-          <w:sz w:val="24"/>
-          <w:szCs w:val="24"/>
-        </w:rPr>
-        <w:t xml:space="preserve">The same rule applies across all of them: the closer the content gets to a promise a reader will act on, the more a qualified person needs to write or approve it.</w:t>
+        <w:t xml:space="preserve"> Use AI to generate headline and copy variations for testing, not to decide what you promise. Any claim on an ad or landing page needs to be one you can prove.</w:t>
+      </w:r>
+    </w:p>
+    <w:p>
+      <w:pPr>
+        <w:spacing w:after="160"/>
+      </w:pPr>
+      <w:r>
+        <w:rPr>
+          <w:rFonts w:ascii="Calibri" w:cs="Calibri" w:eastAsia="Calibri" w:hAnsi="Calibri"/>
+          <w:color w:val="333333"/>
+          <w:sz w:val="24"/>
+          <w:szCs w:val="24"/>
+        </w:rPr>
+        <w:t xml:space="preserve">One rule covers all of them: the closer the content gets to a promise a reader will act on, the more a qualified person needs to write or approve it.</w:t>
       </w:r>
     </w:p>
     <w:p>
@@ -1230,7 +1313,7 @@
         </w:rPr>
         <w:t xml:space="preserve">For a business, this becomes a question of which jobs to hand over and how much time to budget. </w:t>
       </w:r>
-      <w:hyperlink w:history="1" r:id="rIdinou353wjsojdf0x3t-dd">
+      <w:hyperlink w:history="1" r:id="rIdlunnjkgykvt9sf1j38ujh">
         <w:r>
           <w:rPr>
             <w:rStyle w:val="Hyperlink"/>
@@ -1281,37 +1364,131 @@
           <w:sz w:val="24"/>
           <w:szCs w:val="24"/>
         </w:rPr>
-        <w:t xml:space="preserve">Raw AI output is not as good as skilled human writing, but AI drafting plus human editing often matches it and is much faster. The difference is less "AI versus human" and more "reviewed versus unreviewed". Unedited AI and lazy human writing fail for the same reason: they add nothing new.</w:t>
-      </w:r>
-    </w:p>
-    <w:p>
-      <w:pPr>
-        <w:spacing w:after="160"/>
-      </w:pPr>
-      <w:r>
-        <w:rPr>
-          <w:rFonts w:ascii="Calibri" w:cs="Calibri" w:eastAsia="Calibri" w:hAnsi="Calibri"/>
-          <w:color w:val="333333"/>
-          <w:sz w:val="24"/>
-          <w:szCs w:val="24"/>
-        </w:rPr>
-        <w:t xml:space="preserve">Where AI is stronger: speed, structure, consistency and covering the basics of a topic. Where people are stronger: original insight, first-hand experience, judgement about what matters, and knowing when a "fact" is wrong.</w:t>
-      </w:r>
-    </w:p>
-    <w:p>
-      <w:pPr>
-        <w:spacing w:after="160"/>
-      </w:pPr>
-      <w:r>
-        <w:rPr>
-          <w:rFonts w:ascii="Calibri" w:cs="Calibri" w:eastAsia="Calibri" w:hAnsi="Calibri"/>
-          <w:color w:val="333333"/>
-          <w:sz w:val="24"/>
-          <w:szCs w:val="24"/>
-        </w:rPr>
-        <w:t xml:space="preserve">That's why the most useful question isn't whether to use AI, but where in the process a person adds value. I compare the two approaches in detail, including cost, quality and when to choose each, in </w:t>
-      </w:r>
-      <w:hyperlink w:history="1" r:id="rId0x4ynodzj00rrcikuyvue">
+        <w:t xml:space="preserve">Raw AI output is not as good as skilled human writing, but an AI draft edited by someone who knows the subject often matches it, in far less time. The real divide is reviewed versus unreviewed, not AI versus human. Unedited AI and lazy human writing fail for the same reason: they add nothing new.</w:t>
+      </w:r>
+    </w:p>
+    <w:p>
+      <w:pPr>
+        <w:spacing w:after="160"/>
+      </w:pPr>
+      <w:r>
+        <w:rPr>
+          <w:rFonts w:ascii="Calibri" w:cs="Calibri" w:eastAsia="Calibri" w:hAnsi="Calibri"/>
+          <w:color w:val="333333"/>
+          <w:sz w:val="24"/>
+          <w:szCs w:val="24"/>
+        </w:rPr>
+        <w:t xml:space="preserve">AI is stronger on speed, structure and covering the basics of a topic. People are stronger on original insight, first-hand experience, judgement about what matters, and spotting when a "fact" is wrong.</w:t>
+      </w:r>
+    </w:p>
+    <w:p>
+      <w:pPr>
+        <w:spacing w:after="160"/>
+      </w:pPr>
+      <w:r>
+        <w:rPr>
+          <w:rFonts w:ascii="Calibri" w:cs="Calibri" w:eastAsia="Calibri" w:hAnsi="Calibri"/>
+          <w:color w:val="333333"/>
+          <w:sz w:val="24"/>
+          <w:szCs w:val="24"/>
+        </w:rPr>
+        <w:t xml:space="preserve">The difference shows up in a single paragraph. Below is a raw draft from a post about blog length, and the same paragraph after editing:</w:t>
+      </w:r>
+    </w:p>
+    <w:p>
+      <w:pPr>
+        <w:pBdr>
+          <w:left w:val="single" w:color="7C3AED" w:sz="18" w:space="8"/>
+        </w:pBdr>
+        <w:shd w:fill="F0ECFF" w:val="clear"/>
+        <w:spacing w:after="160"/>
+      </w:pPr>
+      <w:r>
+        <w:rPr>
+          <w:rFonts w:ascii="Calibri" w:cs="Calibri" w:eastAsia="Calibri" w:hAnsi="Calibri"/>
+          <w:b/>
+          <w:bCs/>
+          <w:i/>
+          <w:iCs/>
+          <w:color w:val="333333"/>
+          <w:sz w:val="24"/>
+          <w:szCs w:val="24"/>
+        </w:rPr>
+        <w:t xml:space="preserve">Raw AI draft:</w:t>
+      </w:r>
+      <w:r>
+        <w:rPr>
+          <w:rFonts w:ascii="Calibri" w:cs="Calibri" w:eastAsia="Calibri" w:hAnsi="Calibri"/>
+          <w:i/>
+          <w:iCs/>
+          <w:color w:val="333333"/>
+          <w:sz w:val="24"/>
+          <w:szCs w:val="24"/>
+        </w:rPr>
+        <w:t xml:space="preserve"> "The ideal blog post length depends on various factors, including your audience, topic and goals. Longer posts can help improve SEO, while shorter posts may be better for engagement."</w:t>
+      </w:r>
+    </w:p>
+    <w:p>
+      <w:pPr>
+        <w:pBdr>
+          <w:left w:val="single" w:color="7C3AED" w:sz="18" w:space="8"/>
+        </w:pBdr>
+        <w:shd w:fill="F0ECFF" w:val="clear"/>
+        <w:spacing w:after="160"/>
+      </w:pPr>
+      <w:r>
+        <w:rPr>
+          <w:rFonts w:ascii="Calibri" w:cs="Calibri" w:eastAsia="Calibri" w:hAnsi="Calibri"/>
+          <w:b/>
+          <w:bCs/>
+          <w:i/>
+          <w:iCs/>
+          <w:color w:val="333333"/>
+          <w:sz w:val="24"/>
+          <w:szCs w:val="24"/>
+        </w:rPr>
+        <w:t xml:space="preserve">Edited:</w:t>
+      </w:r>
+      <w:r>
+        <w:rPr>
+          <w:rFonts w:ascii="Calibri" w:cs="Calibri" w:eastAsia="Calibri" w:hAnsi="Calibri"/>
+          <w:i/>
+          <w:iCs/>
+          <w:color w:val="333333"/>
+          <w:sz w:val="24"/>
+          <w:szCs w:val="24"/>
+        </w:rPr>
+        <w:t xml:space="preserve"> "Write until the question is answered, then stop. A definition might need 300 words; a guide comparing ten tools might need 3,000. Before you decide, check the top five results for your keyword. If every one runs past 2,000 words, a 600-word post probably won't satisfy the same searcher."</w:t>
+      </w:r>
+    </w:p>
+    <w:p>
+      <w:pPr>
+        <w:spacing w:after="160"/>
+      </w:pPr>
+      <w:r>
+        <w:rPr>
+          <w:rFonts w:ascii="Calibri" w:cs="Calibri" w:eastAsia="Calibri" w:hAnsi="Calibri"/>
+          <w:color w:val="333333"/>
+          <w:sz w:val="24"/>
+          <w:szCs w:val="24"/>
+        </w:rPr>
+        <w:t xml:space="preserve">The first version is accurate and useless: it could appear on any site. The second takes a position, gives the reader a test they can run today and explains why. That's the edit AI rarely makes for you.</w:t>
+      </w:r>
+    </w:p>
+    <w:p>
+      <w:pPr>
+        <w:spacing w:after="160"/>
+      </w:pPr>
+      <w:r>
+        <w:rPr>
+          <w:rFonts w:ascii="Calibri" w:cs="Calibri" w:eastAsia="Calibri" w:hAnsi="Calibri"/>
+          <w:color w:val="333333"/>
+          <w:sz w:val="24"/>
+          <w:szCs w:val="24"/>
+        </w:rPr>
+        <w:t xml:space="preserve">I compare the two approaches in detail, including cost, quality and when to choose each, in </w:t>
+      </w:r>
+      <w:hyperlink w:history="1" r:id="rIdlxbwdkghuumcthvt7dwan">
         <w:r>
           <w:rPr>
             <w:rStyle w:val="Hyperlink"/>
@@ -1712,7 +1889,7 @@
           <w:sz w:val="24"/>
           <w:szCs w:val="24"/>
         </w:rPr>
-        <w:t xml:space="preserve">My own setup is simple. Claude is my first choice for writing because it follows long, detailed instructions consistently, which is what keeps drafts on-brand. ChatGPT is what I use for images. WordPress is where everything gets published.</w:t>
+        <w:t xml:space="preserve">My own setup is simple. Claude is my first choice for writing because it follows long, detailed instructions reliably, which is what keeps drafts on-brand. I use ChatGPT for images and quick everyday questions. WordPress is where everything gets published.</w:t>
       </w:r>
     </w:p>
     <w:p>
@@ -1728,7 +1905,7 @@
         </w:rPr>
         <w:t xml:space="preserve">If you're choosing for the first time, </w:t>
       </w:r>
-      <w:hyperlink w:history="1" r:id="rId-tbmu3mbcbbguvx304nrm">
+      <w:hyperlink w:history="1" r:id="rIdpggtstfb5e0lbcycy3yek">
         <w:r>
           <w:rPr>
             <w:rStyle w:val="Hyperlink"/>
@@ -1975,7 +2152,7 @@
         </w:rPr>
         <w:t xml:space="preserve"> Let AI write section by section from your outline and facts, not the whole article from one prompt. The </w:t>
       </w:r>
-      <w:hyperlink w:history="1" r:id="rIdiqvuhhvydo9wnjemc0aht">
+      <w:hyperlink w:history="1" r:id="rIdiqbhymyatdxzd7jptr6m-">
         <w:r>
           <w:rPr>
             <w:rStyle w:val="Hyperlink"/>
@@ -2029,9 +2206,9 @@
           <w:sz w:val="24"/>
           <w:szCs w:val="24"/>
         </w:rPr>
-        <w:t xml:space="preserve"> Remove filler, add first-hand examples, vary sentence rhythm and check every claim. </w:t>
-      </w:r>
-      <w:hyperlink w:history="1" r:id="rIdetbay5blf2yevaxfz6wz2">
+        <w:t xml:space="preserve"> Remove filler, add your own examples, vary sentence rhythm and verify each claim. </w:t>
+      </w:r>
+      <w:hyperlink w:history="1" r:id="rIdawkzo4vcvqpw8qlnfqmqj">
         <w:r>
           <w:rPr>
             <w:rStyle w:val="Hyperlink"/>
@@ -2053,7 +2230,7 @@
         </w:rPr>
         <w:t xml:space="preserve"> covers the editing techniques. If you're reworking existing text, know the difference between </w:t>
       </w:r>
-      <w:hyperlink w:history="1" r:id="rIdw_1cfx0_jiuvsfhih07h_">
+      <w:hyperlink w:history="1" r:id="rIdwc6-7kevycvtfvepm3ya5">
         <w:r>
           <w:rPr>
             <w:rStyle w:val="Hyperlink"/>
@@ -2109,7 +2286,7 @@
         </w:rPr>
         <w:t xml:space="preserve"> Write a title that earns the click (</w:t>
       </w:r>
-      <w:hyperlink w:history="1" r:id="rIdkghojwahkaw7nqc-_xnys">
+      <w:hyperlink w:history="1" r:id="rIdudmgxy1kelzti-8ukde4c">
         <w:r>
           <w:rPr>
             <w:rStyle w:val="Hyperlink"/>
@@ -2131,7 +2308,7 @@
         </w:rPr>
         <w:t xml:space="preserve">), check the text is easy to read (</w:t>
       </w:r>
-      <w:hyperlink w:history="1" r:id="rIdricbefn5svno-1irzmrmf">
+      <w:hyperlink w:history="1" r:id="rIdo_-17hgcrziyxtryta7zn">
         <w:r>
           <w:rPr>
             <w:rStyle w:val="Hyperlink"/>
@@ -2153,7 +2330,7 @@
         </w:rPr>
         <w:t xml:space="preserve">) and make sure the length fits the topic (</w:t>
       </w:r>
-      <w:hyperlink w:history="1" r:id="rIdvu-fqhnuybltilsqqd6an">
+      <w:hyperlink w:history="1" r:id="rId6wwm26xhs7f7x314pz8m2">
         <w:r>
           <w:rPr>
             <w:rStyle w:val="Hyperlink"/>
@@ -2212,16 +2389,309 @@
     </w:p>
     <w:p>
       <w:pPr>
-        <w:spacing w:after="160"/>
-      </w:pPr>
-      <w:r>
-        <w:rPr>
-          <w:rFonts w:ascii="Calibri" w:cs="Calibri" w:eastAsia="Calibri" w:hAnsi="Calibri"/>
-          <w:color w:val="333333"/>
-          <w:sz w:val="24"/>
-          <w:szCs w:val="24"/>
-        </w:rPr>
-        <w:t xml:space="preserve">One habit made the biggest difference for me: saving the brief in one place so the AI starts every draft already knowing the business. In Claude that's a Project with instructions and reference files. In other tools, a saved instruction document does the same job.</w:t>
+        <w:pStyle w:val="Heading3"/>
+        <w:spacing w:after="80" w:before="200"/>
+      </w:pPr>
+      <w:r>
+        <w:rPr>
+          <w:rFonts w:ascii="Calibri" w:cs="Calibri" w:eastAsia="Calibri" w:hAnsi="Calibri"/>
+          <w:b/>
+          <w:bCs/>
+          <w:color w:val="333333"/>
+          <w:sz w:val="28"/>
+          <w:szCs w:val="28"/>
+        </w:rPr>
+        <w:t xml:space="preserve">A brief the AI can't misread</w:t>
+      </w:r>
+    </w:p>
+    <w:p>
+      <w:pPr>
+        <w:spacing w:after="160"/>
+      </w:pPr>
+      <w:r>
+        <w:rPr>
+          <w:rFonts w:ascii="Calibri" w:cs="Calibri" w:eastAsia="Calibri" w:hAnsi="Calibri"/>
+          <w:color w:val="333333"/>
+          <w:sz w:val="24"/>
+          <w:szCs w:val="24"/>
+        </w:rPr>
+        <w:t xml:space="preserve">One habit made the biggest difference for me: saving the brief in one place so the AI starts each draft already knowing the business. In Claude that's a Project with instructions and reference files; in other tools, a saved instruction document does the same job. Mine covers six things:</w:t>
+      </w:r>
+    </w:p>
+    <w:tbl>
+      <w:tblPr>
+        <w:tblW w:type="pct" w:w="100%"/>
+        <w:tblBorders>
+          <w:top w:val="single" w:color="auto" w:sz="4"/>
+          <w:left w:val="single" w:color="auto" w:sz="4"/>
+          <w:bottom w:val="single" w:color="auto" w:sz="4"/>
+          <w:right w:val="single" w:color="auto" w:sz="4"/>
+          <w:insideH w:val="single" w:color="auto" w:sz="4"/>
+          <w:insideV w:val="single" w:color="auto" w:sz="4"/>
+        </w:tblBorders>
+      </w:tblPr>
+      <w:tblGrid>
+        <w:gridCol w:w="100"/>
+        <w:gridCol w:w="100"/>
+      </w:tblGrid>
+      <w:tr>
+        <w:tc>
+          <w:tcPr>
+            <w:tcW w:type="dxa" w:w="2250"/>
+            <w:shd w:fill="F0ECFF" w:val="clear"/>
+          </w:tcPr>
+          <w:p>
+            <w:r>
+              <w:rPr>
+                <w:rFonts w:ascii="Calibri" w:cs="Calibri" w:eastAsia="Calibri" w:hAnsi="Calibri"/>
+                <w:b/>
+                <w:bCs/>
+                <w:color w:val="1A1A2E"/>
+                <w:sz w:val="24"/>
+                <w:szCs w:val="24"/>
+              </w:rPr>
+              <w:t xml:space="preserve">Brief field</w:t>
+            </w:r>
+          </w:p>
+        </w:tc>
+        <w:tc>
+          <w:tcPr>
+            <w:tcW w:type="dxa" w:w="2250"/>
+            <w:shd w:fill="F0ECFF" w:val="clear"/>
+          </w:tcPr>
+          <w:p>
+            <w:r>
+              <w:rPr>
+                <w:rFonts w:ascii="Calibri" w:cs="Calibri" w:eastAsia="Calibri" w:hAnsi="Calibri"/>
+                <w:b/>
+                <w:bCs/>
+                <w:color w:val="1A1A2E"/>
+                <w:sz w:val="24"/>
+                <w:szCs w:val="24"/>
+              </w:rPr>
+              <w:t xml:space="preserve">Example</w:t>
+            </w:r>
+          </w:p>
+        </w:tc>
+      </w:tr>
+      <w:tr>
+        <w:tc>
+          <w:tcPr>
+            <w:tcW w:type="dxa" w:w="2250"/>
+          </w:tcPr>
+          <w:p>
+            <w:r>
+              <w:rPr>
+                <w:rFonts w:ascii="Calibri" w:cs="Calibri" w:eastAsia="Calibri" w:hAnsi="Calibri"/>
+                <w:color w:val="333333"/>
+                <w:sz w:val="24"/>
+                <w:szCs w:val="24"/>
+              </w:rPr>
+              <w:t xml:space="preserve">Reader</w:t>
+            </w:r>
+          </w:p>
+        </w:tc>
+        <w:tc>
+          <w:tcPr>
+            <w:tcW w:type="dxa" w:w="2250"/>
+          </w:tcPr>
+          <w:p>
+            <w:r>
+              <w:rPr>
+                <w:rFonts w:ascii="Calibri" w:cs="Calibri" w:eastAsia="Calibri" w:hAnsi="Calibri"/>
+                <w:color w:val="333333"/>
+                <w:sz w:val="24"/>
+                <w:szCs w:val="24"/>
+              </w:rPr>
+              <w:t xml:space="preserve">Small business owners with no SEO background</w:t>
+            </w:r>
+          </w:p>
+        </w:tc>
+      </w:tr>
+      <w:tr>
+        <w:tc>
+          <w:tcPr>
+            <w:tcW w:type="dxa" w:w="2250"/>
+          </w:tcPr>
+          <w:p>
+            <w:r>
+              <w:rPr>
+                <w:rFonts w:ascii="Calibri" w:cs="Calibri" w:eastAsia="Calibri" w:hAnsi="Calibri"/>
+                <w:color w:val="333333"/>
+                <w:sz w:val="24"/>
+                <w:szCs w:val="24"/>
+              </w:rPr>
+              <w:t xml:space="preserve">Search question</w:t>
+            </w:r>
+          </w:p>
+        </w:tc>
+        <w:tc>
+          <w:tcPr>
+            <w:tcW w:type="dxa" w:w="2250"/>
+          </w:tcPr>
+          <w:p>
+            <w:r>
+              <w:rPr>
+                <w:rFonts w:ascii="Calibri" w:cs="Calibri" w:eastAsia="Calibri" w:hAnsi="Calibri"/>
+                <w:color w:val="333333"/>
+                <w:sz w:val="24"/>
+                <w:szCs w:val="24"/>
+              </w:rPr>
+              <w:t xml:space="preserve">"Is AI writing good for SEO?"</w:t>
+            </w:r>
+          </w:p>
+        </w:tc>
+      </w:tr>
+      <w:tr>
+        <w:tc>
+          <w:tcPr>
+            <w:tcW w:type="dxa" w:w="2250"/>
+          </w:tcPr>
+          <w:p>
+            <w:r>
+              <w:rPr>
+                <w:rFonts w:ascii="Calibri" w:cs="Calibri" w:eastAsia="Calibri" w:hAnsi="Calibri"/>
+                <w:color w:val="333333"/>
+                <w:sz w:val="24"/>
+                <w:szCs w:val="24"/>
+              </w:rPr>
+              <w:t xml:space="preserve">Angle</w:t>
+            </w:r>
+          </w:p>
+        </w:tc>
+        <w:tc>
+          <w:tcPr>
+            <w:tcW w:type="dxa" w:w="2250"/>
+          </w:tcPr>
+          <w:p>
+            <w:r>
+              <w:rPr>
+                <w:rFonts w:ascii="Calibri" w:cs="Calibri" w:eastAsia="Calibri" w:hAnsi="Calibri"/>
+                <w:color w:val="333333"/>
+                <w:sz w:val="24"/>
+                <w:szCs w:val="24"/>
+              </w:rPr>
+              <w:t xml:space="preserve">What the data says, plus what I've seen on live sites</w:t>
+            </w:r>
+          </w:p>
+        </w:tc>
+      </w:tr>
+      <w:tr>
+        <w:tc>
+          <w:tcPr>
+            <w:tcW w:type="dxa" w:w="2250"/>
+          </w:tcPr>
+          <w:p>
+            <w:r>
+              <w:rPr>
+                <w:rFonts w:ascii="Calibri" w:cs="Calibri" w:eastAsia="Calibri" w:hAnsi="Calibri"/>
+                <w:color w:val="333333"/>
+                <w:sz w:val="24"/>
+                <w:szCs w:val="24"/>
+              </w:rPr>
+              <w:t xml:space="preserve">Facts to use</w:t>
+            </w:r>
+          </w:p>
+        </w:tc>
+        <w:tc>
+          <w:tcPr>
+            <w:tcW w:type="dxa" w:w="2250"/>
+          </w:tcPr>
+          <w:p>
+            <w:r>
+              <w:rPr>
+                <w:rFonts w:ascii="Calibri" w:cs="Calibri" w:eastAsia="Calibri" w:hAnsi="Calibri"/>
+                <w:color w:val="333333"/>
+                <w:sz w:val="24"/>
+                <w:szCs w:val="24"/>
+              </w:rPr>
+              <w:t xml:space="preserve">Pasted sources and my own numbers, nothing else</w:t>
+            </w:r>
+          </w:p>
+        </w:tc>
+      </w:tr>
+      <w:tr>
+        <w:tc>
+          <w:tcPr>
+            <w:tcW w:type="dxa" w:w="2250"/>
+          </w:tcPr>
+          <w:p>
+            <w:r>
+              <w:rPr>
+                <w:rFonts w:ascii="Calibri" w:cs="Calibri" w:eastAsia="Calibri" w:hAnsi="Calibri"/>
+                <w:color w:val="333333"/>
+                <w:sz w:val="24"/>
+                <w:szCs w:val="24"/>
+              </w:rPr>
+              <w:t xml:space="preserve">Voice rules</w:t>
+            </w:r>
+          </w:p>
+        </w:tc>
+        <w:tc>
+          <w:tcPr>
+            <w:tcW w:type="dxa" w:w="2250"/>
+          </w:tcPr>
+          <w:p>
+            <w:r>
+              <w:rPr>
+                <w:rFonts w:ascii="Calibri" w:cs="Calibri" w:eastAsia="Calibri" w:hAnsi="Calibri"/>
+                <w:color w:val="333333"/>
+                <w:sz w:val="24"/>
+                <w:szCs w:val="24"/>
+              </w:rPr>
+              <w:t xml:space="preserve">UK English, short paragraphs, banned-word list</w:t>
+            </w:r>
+          </w:p>
+        </w:tc>
+      </w:tr>
+      <w:tr>
+        <w:tc>
+          <w:tcPr>
+            <w:tcW w:type="dxa" w:w="2250"/>
+          </w:tcPr>
+          <w:p>
+            <w:r>
+              <w:rPr>
+                <w:rFonts w:ascii="Calibri" w:cs="Calibri" w:eastAsia="Calibri" w:hAnsi="Calibri"/>
+                <w:color w:val="333333"/>
+                <w:sz w:val="24"/>
+                <w:szCs w:val="24"/>
+              </w:rPr>
+              <w:t xml:space="preserve">Format</w:t>
+            </w:r>
+          </w:p>
+        </w:tc>
+        <w:tc>
+          <w:tcPr>
+            <w:tcW w:type="dxa" w:w="2250"/>
+          </w:tcPr>
+          <w:p>
+            <w:r>
+              <w:rPr>
+                <w:rFonts w:ascii="Calibri" w:cs="Calibri" w:eastAsia="Calibri" w:hAnsi="Calibri"/>
+                <w:color w:val="333333"/>
+                <w:sz w:val="24"/>
+                <w:szCs w:val="24"/>
+              </w:rPr>
+              <w:t xml:space="preserve">Question-style H2s, direct answer first, one table</w:t>
+            </w:r>
+          </w:p>
+        </w:tc>
+      </w:tr>
+    </w:tbl>
+    <w:p/>
+    <w:p>
+      <w:pPr>
+        <w:spacing w:after="160"/>
+      </w:pPr>
+      <w:r>
+        <w:rPr>
+          <w:rFonts w:ascii="Calibri" w:cs="Calibri" w:eastAsia="Calibri" w:hAnsi="Calibri"/>
+          <w:color w:val="333333"/>
+          <w:sz w:val="24"/>
+          <w:szCs w:val="24"/>
+        </w:rPr>
+        <w:t xml:space="preserve">With that saved, each new draft needs a two-line prompt instead of a page of instructions.</w:t>
       </w:r>
     </w:p>
     <w:p>
@@ -2703,9 +3173,9 @@
           <w:sz w:val="24"/>
           <w:szCs w:val="24"/>
         </w:rPr>
-        <w:t xml:space="preserve">The largest public test of this is Ahrefs' July 2025 study of 600,000 top-ranking pages, which found </w:t>
-      </w:r>
-      <w:hyperlink w:history="1" r:id="rIdupwvb0uyeki-zpje5xkld">
+        <w:t xml:space="preserve">The largest public test of this is Ahrefs' July 2025 study of 600,000 top-ranking pages across 100,000 keywords. It found </w:t>
+      </w:r>
+      <w:hyperlink w:history="1" r:id="rId6drv0qjqzyy6pa9dv_bfx">
         <w:r>
           <w:rPr>
             <w:rStyle w:val="Hyperlink"/>
@@ -2725,21 +3195,21 @@
           <w:sz w:val="24"/>
           <w:szCs w:val="24"/>
         </w:rPr>
-        <w:t xml:space="preserve">, in other words none. Most ranking pages mixed human and AI writing.</w:t>
-      </w:r>
-    </w:p>
-    <w:p>
-      <w:pPr>
-        <w:spacing w:after="160"/>
-      </w:pPr>
-      <w:r>
-        <w:rPr>
-          <w:rFonts w:ascii="Calibri" w:cs="Calibri" w:eastAsia="Calibri" w:hAnsi="Calibri"/>
-          <w:color w:val="333333"/>
-          <w:sz w:val="24"/>
-          <w:szCs w:val="24"/>
-        </w:rPr>
-        <w:t xml:space="preserve">What makes AI content rank is the same as what makes any content rank:</w:t>
+        <w:t xml:space="preserve">, in other words none, and 81.9% of the ranking pages mixed human and AI writing.</w:t>
+      </w:r>
+    </w:p>
+    <w:p>
+      <w:pPr>
+        <w:spacing w:after="160"/>
+      </w:pPr>
+      <w:r>
+        <w:rPr>
+          <w:rFonts w:ascii="Calibri" w:cs="Calibri" w:eastAsia="Calibri" w:hAnsi="Calibri"/>
+          <w:color w:val="333333"/>
+          <w:sz w:val="24"/>
+          <w:szCs w:val="24"/>
+        </w:rPr>
+        <w:t xml:space="preserve">What makes AI content rank is what makes any content rank:</w:t>
       </w:r>
     </w:p>
     <w:p>
@@ -2797,9 +3267,9 @@
           <w:sz w:val="24"/>
           <w:szCs w:val="24"/>
         </w:rPr>
-        <w:t xml:space="preserve"> Google's 2026 guidance on AI features warns against </w:t>
-      </w:r>
-      <w:hyperlink w:history="1" r:id="rIdvqnkf-vecbdrswotywevg">
+        <w:t xml:space="preserve"> Google's July 2026 guide to generative AI features warns against </w:t>
+      </w:r>
+      <w:hyperlink w:history="1" r:id="rId3jryb6t6wj5pqesebv2pb">
         <w:r>
           <w:rPr>
             <w:rStyle w:val="Hyperlink"/>
@@ -2819,7 +3289,7 @@
           <w:sz w:val="24"/>
           <w:szCs w:val="24"/>
         </w:rPr>
-        <w:t xml:space="preserve"> built on common knowledge, and asks for "unique expert or experienced takes". A test, a dataset or a real example does that. A reworded competitor article doesn't.</w:t>
+        <w:t xml:space="preserve"> built on common knowledge and asks for "unique expert or experienced takes". A test, a dataset or a real example does that. A reworded competitor article doesn't.</w:t>
       </w:r>
     </w:p>
     <w:p>
@@ -2882,18 +3352,35 @@
     </w:p>
     <w:p>
       <w:pPr>
-        <w:spacing w:after="160"/>
-      </w:pPr>
-      <w:r>
-        <w:rPr>
-          <w:rFonts w:ascii="Calibri" w:cs="Calibri" w:eastAsia="Calibri" w:hAnsi="Calibri"/>
-          <w:color w:val="333333"/>
-          <w:sz w:val="24"/>
-          <w:szCs w:val="24"/>
-        </w:rPr>
-        <w:t xml:space="preserve">AI search follows the same rules. Google says there are </w:t>
-      </w:r>
-      <w:hyperlink w:history="1" r:id="rIduoknqws7n73w6unbiik8a">
+        <w:pStyle w:val="Heading3"/>
+        <w:spacing w:after="80" w:before="200"/>
+      </w:pPr>
+      <w:r>
+        <w:rPr>
+          <w:rFonts w:ascii="Calibri" w:cs="Calibri" w:eastAsia="Calibri" w:hAnsi="Calibri"/>
+          <w:b/>
+          <w:bCs/>
+          <w:color w:val="333333"/>
+          <w:sz w:val="28"/>
+          <w:szCs w:val="28"/>
+        </w:rPr>
+        <w:t xml:space="preserve">How do you get AI content into AI Overviews?</w:t>
+      </w:r>
+    </w:p>
+    <w:p>
+      <w:pPr>
+        <w:spacing w:after="160"/>
+      </w:pPr>
+      <w:r>
+        <w:rPr>
+          <w:rFonts w:ascii="Calibri" w:cs="Calibri" w:eastAsia="Calibri" w:hAnsi="Calibri"/>
+          <w:color w:val="333333"/>
+          <w:sz w:val="24"/>
+          <w:szCs w:val="24"/>
+        </w:rPr>
+        <w:t xml:space="preserve">To appear in AI Overviews and AI Mode, a page needs to be indexed and eligible to show a snippet in normal search; Google lists </w:t>
+      </w:r>
+      <w:hyperlink w:history="1" r:id="rIdqll6x-obtjym6iorwkmzq">
         <w:r>
           <w:rPr>
             <w:rStyle w:val="Hyperlink"/>
@@ -2903,7 +3390,7 @@
             <w:szCs w:val="24"/>
             <w:u w:val="single"/>
           </w:rPr>
-          <w:t xml:space="preserve">no additional requirements</w:t>
+          <w:t xml:space="preserve">no special optimisations</w:t>
         </w:r>
       </w:hyperlink>
       <w:r>
@@ -2913,7 +3400,29 @@
           <w:sz w:val="24"/>
           <w:szCs w:val="24"/>
         </w:rPr>
-        <w:t xml:space="preserve"> to appear in AI Overviews or AI Mode beyond being indexed and eligible for a snippet. Clear, well-structured, original pages are what get quoted.</w:t>
+        <w:t xml:space="preserve"> beyond that. One new setting matters in 2026: since 31 August, Search Console has had a </w:t>
+      </w:r>
+      <w:hyperlink w:history="1" r:id="rId7xia5x_ksr4rek19b0wmj">
+        <w:r>
+          <w:rPr>
+            <w:rStyle w:val="Hyperlink"/>
+            <w:rFonts w:ascii="Calibri" w:cs="Calibri" w:eastAsia="Calibri" w:hAnsi="Calibri"/>
+            <w:color w:val="0563C1"/>
+            <w:sz w:val="24"/>
+            <w:szCs w:val="24"/>
+            <w:u w:val="single"/>
+          </w:rPr>
+          <w:t xml:space="preserve">control for generative AI features</w:t>
+        </w:r>
+      </w:hyperlink>
+      <w:r>
+        <w:rPr>
+          <w:rFonts w:ascii="Calibri" w:cs="Calibri" w:eastAsia="Calibri" w:hAnsi="Calibri"/>
+          <w:color w:val="333333"/>
+          <w:sz w:val="24"/>
+          <w:szCs w:val="24"/>
+        </w:rPr>
+        <w:t xml:space="preserve">. Inclusion is the default, so do nothing if you want to be cited, and check that nobody has switched it off.</w:t>
       </w:r>
     </w:p>
     <w:p>
@@ -2930,7 +3439,7 @@
           <w:sz w:val="36"/>
           <w:szCs w:val="36"/>
         </w:rPr>
-        <w:t xml:space="preserve">Can Google detect AI content, and is it against Google's policies?</w:t>
+        <w:t xml:space="preserve">Is AI content against Google's policies, and can Google detect it?</w:t>
       </w:r>
     </w:p>
     <w:p>
@@ -2946,7 +3455,7 @@
         </w:rPr>
         <w:t xml:space="preserve">AI content is not against Google's policies, and Google does not rank pages on whether AI wrote them. Google's </w:t>
       </w:r>
-      <w:hyperlink w:history="1" r:id="rIda5lqiwn2wqom9kdw2ic6z">
+      <w:hyperlink w:history="1" r:id="rIdbcxgz9rl3kvhb-skxv0dn">
         <w:r>
           <w:rPr>
             <w:rStyle w:val="Hyperlink"/>
@@ -2966,7 +3475,7 @@
           <w:sz w:val="24"/>
           <w:szCs w:val="24"/>
         </w:rPr>
-        <w:t xml:space="preserve"> says it rewards high-quality content however it's produced. What breaks its rules is using AI, or anything else, to publish large amounts of low-value content to manipulate rankings.</w:t>
+        <w:t xml:space="preserve"> says it rewards high-quality content however it's produced. What breaks its rules is publishing large amounts of low-value content to manipulate rankings, whether AI or people produce it.</w:t>
       </w:r>
     </w:p>
     <w:p>
@@ -2982,7 +3491,7 @@
         </w:rPr>
         <w:t xml:space="preserve">That rule is called scaled content abuse, and it's defined in Google's </w:t>
       </w:r>
-      <w:hyperlink w:history="1" r:id="rIdwfu-khmml5hwwnwmifvmf">
+      <w:hyperlink w:history="1" r:id="rIdekpuoj65tjohfifjreqcc">
         <w:r>
           <w:rPr>
             <w:rStyle w:val="Hyperlink"/>
@@ -3002,23 +3511,23 @@
           <w:sz w:val="24"/>
           <w:szCs w:val="24"/>
         </w:rPr>
-        <w:t xml:space="preserve">: generating many pages primarily to manipulate rankings rather than help users, whether by AI, people or both.</w:t>
-      </w:r>
-    </w:p>
-    <w:p>
-      <w:pPr>
-        <w:spacing w:after="160"/>
-      </w:pPr>
-      <w:r>
-        <w:rPr>
-          <w:rFonts w:ascii="Calibri" w:cs="Calibri" w:eastAsia="Calibri" w:hAnsi="Calibri"/>
-          <w:color w:val="333333"/>
-          <w:sz w:val="24"/>
-          <w:szCs w:val="24"/>
-        </w:rPr>
-        <w:t xml:space="preserve">Whether Google can technically detect AI text is a separate and more complicated question. It involves watermarks, spam systems and the limits of AI detectors, and I tested detectors myself to find out how reliable they are. That's all covered in </w:t>
-      </w:r>
-      <w:hyperlink w:history="1" r:id="rIdbetjkzzi-juzkglxazpmy">
+        <w:t xml:space="preserve"> as generating many pages "for the primary purpose of manipulating search rankings and not helping users".</w:t>
+      </w:r>
+    </w:p>
+    <w:p>
+      <w:pPr>
+        <w:spacing w:after="160"/>
+      </w:pPr>
+      <w:r>
+        <w:rPr>
+          <w:rFonts w:ascii="Calibri" w:cs="Calibri" w:eastAsia="Calibri" w:hAnsi="Calibri"/>
+          <w:color w:val="333333"/>
+          <w:sz w:val="24"/>
+          <w:szCs w:val="24"/>
+        </w:rPr>
+        <w:t xml:space="preserve">Whether Google can technically detect AI text is a separate and more complicated question. It involves watermarks, spam systems and the limits of AI detectors, and I tested detectors myself to see how reliable they are. That's all in </w:t>
+      </w:r>
+      <w:hyperlink w:history="1" r:id="rIdddgsjposvzlqso2p2l74b">
         <w:r>
           <w:rPr>
             <w:rStyle w:val="Hyperlink"/>
@@ -3046,21 +3555,21 @@
           <w:sz w:val="36"/>
           <w:szCs w:val="36"/>
         </w:rPr>
-        <w:t xml:space="preserve">What are the risks of AI content writing?</w:t>
-      </w:r>
-    </w:p>
-    <w:p>
-      <w:pPr>
-        <w:spacing w:after="160"/>
-      </w:pPr>
-      <w:r>
-        <w:rPr>
-          <w:rFonts w:ascii="Calibri" w:cs="Calibri" w:eastAsia="Calibri" w:hAnsi="Calibri"/>
-          <w:color w:val="333333"/>
-          <w:sz w:val="24"/>
-          <w:szCs w:val="24"/>
-        </w:rPr>
-        <w:t xml:space="preserve">The main risks are invented facts, generic content, accidental plagiarism, privacy mistakes and publishing more than you can review. Each is manageable with a clear process; none is a reason to avoid AI entirely.</w:t>
+        <w:t xml:space="preserve">Do you have to disclose that you used AI?</w:t>
+      </w:r>
+    </w:p>
+    <w:p>
+      <w:pPr>
+        <w:spacing w:after="160"/>
+      </w:pPr>
+      <w:r>
+        <w:rPr>
+          <w:rFonts w:ascii="Calibri" w:cs="Calibri" w:eastAsia="Calibri" w:hAnsi="Calibri"/>
+          <w:color w:val="333333"/>
+          <w:sz w:val="24"/>
+          <w:szCs w:val="24"/>
+        </w:rPr>
+        <w:t xml:space="preserve">For most blog posts there's no legal requirement, but Google recommends disclosure where readers would reasonably ask how a page was made, and EU law now requires it in one specific case. A short note costs nothing and builds trust.</w:t>
       </w:r>
     </w:p>
     <w:p>
@@ -3080,18 +3589,18 @@
           <w:sz w:val="24"/>
           <w:szCs w:val="24"/>
         </w:rPr>
-        <w:t xml:space="preserve">Invented facts and sources.</w:t>
-      </w:r>
-      <w:r>
-        <w:rPr>
-          <w:rFonts w:ascii="Calibri" w:cs="Calibri" w:eastAsia="Calibri" w:hAnsi="Calibri"/>
-          <w:color w:val="333333"/>
-          <w:sz w:val="24"/>
-          <w:szCs w:val="24"/>
-        </w:rPr>
-        <w:t xml:space="preserve"> AI states made-up details with confidence. The problem is visible even in academic publishing: a 2026 study in The Lancet found fabricated references in </w:t>
-      </w:r>
-      <w:hyperlink w:history="1" r:id="rIdhle3vhgd8cgmdm-b8ttxe">
+        <w:t xml:space="preserve">Google:</w:t>
+      </w:r>
+      <w:r>
+        <w:rPr>
+          <w:rFonts w:ascii="Calibri" w:cs="Calibri" w:eastAsia="Calibri" w:hAnsi="Calibri"/>
+          <w:color w:val="333333"/>
+          <w:sz w:val="24"/>
+          <w:szCs w:val="24"/>
+        </w:rPr>
+        <w:t xml:space="preserve"> its guide to </w:t>
+      </w:r>
+      <w:hyperlink w:history="1" r:id="rIdjs0_gda-b7mdefnntitdc">
         <w:r>
           <w:rPr>
             <w:rStyle w:val="Hyperlink"/>
@@ -3101,7 +3610,7 @@
             <w:szCs w:val="24"/>
             <w:u w:val="single"/>
           </w:rPr>
-          <w:t xml:space="preserve">1 in 277 research papers in early 2026, up from 1 in 2,828 in 2023</w:t>
+          <w:t xml:space="preserve">creating helpful content</w:t>
         </w:r>
       </w:hyperlink>
       <w:r>
@@ -3111,7 +3620,7 @@
           <w:sz w:val="24"/>
           <w:szCs w:val="24"/>
         </w:rPr>
-        <w:t xml:space="preserve">. Open every source before you publish it.</w:t>
+        <w:t xml:space="preserve"> asks whether the use of automation, including AI, is "self-evident to visitors through disclosures or in other ways", and says disclosures are useful where someone might wonder how the content was created.</w:t>
       </w:r>
     </w:p>
     <w:p>
@@ -3131,16 +3640,105 @@
           <w:sz w:val="24"/>
           <w:szCs w:val="24"/>
         </w:rPr>
-        <w:t xml:space="preserve">Sameness.</w:t>
-      </w:r>
-      <w:r>
-        <w:rPr>
-          <w:rFonts w:ascii="Calibri" w:cs="Calibri" w:eastAsia="Calibri" w:hAnsi="Calibri"/>
-          <w:color w:val="333333"/>
-          <w:sz w:val="24"/>
-          <w:szCs w:val="24"/>
-        </w:rPr>
-        <w:t xml:space="preserve"> If you and your competitors use the same tool with similar prompts, you get similar articles. Your examples, data and opinions are what separate them.</w:t>
+        <w:t xml:space="preserve">EU AI Act:</w:t>
+      </w:r>
+      <w:r>
+        <w:rPr>
+          <w:rFonts w:ascii="Calibri" w:cs="Calibri" w:eastAsia="Calibri" w:hAnsi="Calibri"/>
+          <w:color w:val="333333"/>
+          <w:sz w:val="24"/>
+          <w:szCs w:val="24"/>
+        </w:rPr>
+        <w:t xml:space="preserve"> from 2 August 2026, </w:t>
+      </w:r>
+      <w:hyperlink w:history="1" r:id="rId2fcnxb1nb_daxnkp7ytln">
+        <w:r>
+          <w:rPr>
+            <w:rStyle w:val="Hyperlink"/>
+            <w:rFonts w:ascii="Calibri" w:cs="Calibri" w:eastAsia="Calibri" w:hAnsi="Calibri"/>
+            <w:color w:val="0563C1"/>
+            <w:sz w:val="24"/>
+            <w:szCs w:val="24"/>
+            <w:u w:val="single"/>
+          </w:rPr>
+          <w:t xml:space="preserve">Article 50</w:t>
+        </w:r>
+      </w:hyperlink>
+      <w:r>
+        <w:rPr>
+          <w:rFonts w:ascii="Calibri" w:cs="Calibri" w:eastAsia="Calibri" w:hAnsi="Calibri"/>
+          <w:color w:val="333333"/>
+          <w:sz w:val="24"/>
+          <w:szCs w:val="24"/>
+        </w:rPr>
+        <w:t xml:space="preserve"> requires publishers to disclose AI-generated text that informs the public on matters of public interest, unless a person has reviewed it and someone holds editorial responsibility. It applies if your audience includes people in the EU, wherever you're based.</w:t>
+      </w:r>
+    </w:p>
+    <w:p>
+      <w:pPr>
+        <w:spacing w:after="160"/>
+      </w:pPr>
+      <w:r>
+        <w:rPr>
+          <w:rFonts w:ascii="Calibri" w:cs="Calibri" w:eastAsia="Calibri" w:hAnsi="Calibri"/>
+          <w:color w:val="333333"/>
+          <w:sz w:val="24"/>
+          <w:szCs w:val="24"/>
+        </w:rPr>
+        <w:t xml:space="preserve">The practical answer for a blog: have a named person review and take responsibility for every article, keep a record of that review, and say how you use AI on an editorial policy page. That covers both. </w:t>
+      </w:r>
+      <w:hyperlink w:history="1" r:id="rIdhmyr4ywthr5ro3ooudxkj">
+        <w:r>
+          <w:rPr>
+            <w:rStyle w:val="Hyperlink"/>
+            <w:rFonts w:ascii="Calibri" w:cs="Calibri" w:eastAsia="Calibri" w:hAnsi="Calibri"/>
+            <w:color w:val="0563C1"/>
+            <w:sz w:val="24"/>
+            <w:szCs w:val="24"/>
+            <w:u w:val="single"/>
+          </w:rPr>
+          <w:t xml:space="preserve">Our editorial policy</w:t>
+        </w:r>
+      </w:hyperlink>
+      <w:r>
+        <w:rPr>
+          <w:rFonts w:ascii="Calibri" w:cs="Calibri" w:eastAsia="Calibri" w:hAnsi="Calibri"/>
+          <w:color w:val="333333"/>
+          <w:sz w:val="24"/>
+          <w:szCs w:val="24"/>
+        </w:rPr>
+        <w:t xml:space="preserve"> is an example.</w:t>
+      </w:r>
+    </w:p>
+    <w:p>
+      <w:pPr>
+        <w:pStyle w:val="Heading2"/>
+        <w:spacing w:after="120" w:before="300"/>
+      </w:pPr>
+      <w:r>
+        <w:rPr>
+          <w:rFonts w:ascii="Calibri" w:cs="Calibri" w:eastAsia="Calibri" w:hAnsi="Calibri"/>
+          <w:b/>
+          <w:bCs/>
+          <w:color w:val="7C3AED"/>
+          <w:sz w:val="36"/>
+          <w:szCs w:val="36"/>
+        </w:rPr>
+        <w:t xml:space="preserve">What are the risks of AI content writing?</w:t>
+      </w:r>
+    </w:p>
+    <w:p>
+      <w:pPr>
+        <w:spacing w:after="160"/>
+      </w:pPr>
+      <w:r>
+        <w:rPr>
+          <w:rFonts w:ascii="Calibri" w:cs="Calibri" w:eastAsia="Calibri" w:hAnsi="Calibri"/>
+          <w:color w:val="333333"/>
+          <w:sz w:val="24"/>
+          <w:szCs w:val="24"/>
+        </w:rPr>
+        <w:t xml:space="preserve">The main risks are invented facts, sameness, accidental plagiarism, privacy mistakes and publishing more than you can review. Each is manageable with a clear process; none is a reason to avoid AI entirely.</w:t>
       </w:r>
     </w:p>
     <w:p>
@@ -3160,16 +3758,38 @@
           <w:sz w:val="24"/>
           <w:szCs w:val="24"/>
         </w:rPr>
-        <w:t xml:space="preserve">Plagiarism by paraphrase.</w:t>
-      </w:r>
-      <w:r>
-        <w:rPr>
-          <w:rFonts w:ascii="Calibri" w:cs="Calibri" w:eastAsia="Calibri" w:hAnsi="Calibri"/>
-          <w:color w:val="333333"/>
-          <w:sz w:val="24"/>
-          <w:szCs w:val="24"/>
-        </w:rPr>
-        <w:t xml:space="preserve"> Asking AI to reword someone else's article doesn't make it yours, and Google's spam policies name synonym swapping as scraping.</w:t>
+        <w:t xml:space="preserve">Invented facts and sources.</w:t>
+      </w:r>
+      <w:r>
+        <w:rPr>
+          <w:rFonts w:ascii="Calibri" w:cs="Calibri" w:eastAsia="Calibri" w:hAnsi="Calibri"/>
+          <w:color w:val="333333"/>
+          <w:sz w:val="24"/>
+          <w:szCs w:val="24"/>
+        </w:rPr>
+        <w:t xml:space="preserve"> AI states made-up details with confidence, and the problem now reaches academic publishing: a study published in The Lancet in May 2026 found fabricated references in </w:t>
+      </w:r>
+      <w:hyperlink w:history="1" r:id="rIdpqjybwyq43v0dgjajepo8">
+        <w:r>
+          <w:rPr>
+            <w:rStyle w:val="Hyperlink"/>
+            <w:rFonts w:ascii="Calibri" w:cs="Calibri" w:eastAsia="Calibri" w:hAnsi="Calibri"/>
+            <w:color w:val="0563C1"/>
+            <w:sz w:val="24"/>
+            <w:szCs w:val="24"/>
+            <w:u w:val="single"/>
+          </w:rPr>
+          <w:t xml:space="preserve">1 in 277 papers in early 2026, up from 1 in 2,828 in 2023</w:t>
+        </w:r>
+      </w:hyperlink>
+      <w:r>
+        <w:rPr>
+          <w:rFonts w:ascii="Calibri" w:cs="Calibri" w:eastAsia="Calibri" w:hAnsi="Calibri"/>
+          <w:color w:val="333333"/>
+          <w:sz w:val="24"/>
+          <w:szCs w:val="24"/>
+        </w:rPr>
+        <w:t xml:space="preserve">. Open every source before you publish it.</w:t>
       </w:r>
     </w:p>
     <w:p>
@@ -3189,16 +3809,16 @@
           <w:sz w:val="24"/>
           <w:szCs w:val="24"/>
         </w:rPr>
-        <w:t xml:space="preserve">Privacy.</w:t>
-      </w:r>
-      <w:r>
-        <w:rPr>
-          <w:rFonts w:ascii="Calibri" w:cs="Calibri" w:eastAsia="Calibri" w:hAnsi="Calibri"/>
-          <w:color w:val="333333"/>
-          <w:sz w:val="24"/>
-          <w:szCs w:val="24"/>
-        </w:rPr>
-        <w:t xml:space="preserve"> Don't paste customer data or confidential documents into AI tools unless your use meets UK GDPR and your provider's terms allow it.</w:t>
+        <w:t xml:space="preserve">Sameness.</w:t>
+      </w:r>
+      <w:r>
+        <w:rPr>
+          <w:rFonts w:ascii="Calibri" w:cs="Calibri" w:eastAsia="Calibri" w:hAnsi="Calibri"/>
+          <w:color w:val="333333"/>
+          <w:sz w:val="24"/>
+          <w:szCs w:val="24"/>
+        </w:rPr>
+        <w:t xml:space="preserve"> If you and your competitors use the same tool with similar prompts, you get similar articles. Your examples, data and opinions are what separate them.</w:t>
       </w:r>
     </w:p>
     <w:p>
@@ -3218,339 +3838,16 @@
           <w:sz w:val="24"/>
           <w:szCs w:val="24"/>
         </w:rPr>
-        <w:t xml:space="preserve">Scale without review.</w:t>
-      </w:r>
-      <w:r>
-        <w:rPr>
-          <w:rFonts w:ascii="Calibri" w:cs="Calibri" w:eastAsia="Calibri" w:hAnsi="Calibri"/>
-          <w:color w:val="333333"/>
-          <w:sz w:val="24"/>
-          <w:szCs w:val="24"/>
-        </w:rPr>
-        <w:t xml:space="preserve"> Publishing faster than you can check is how sites end up with the low-value pages Google's spam updates target.</w:t>
-      </w:r>
-    </w:p>
-    <w:p>
-      <w:pPr>
-        <w:pStyle w:val="Heading2"/>
-        <w:spacing w:after="120" w:before="300"/>
-      </w:pPr>
-      <w:r>
-        <w:rPr>
-          <w:rFonts w:ascii="Calibri" w:cs="Calibri" w:eastAsia="Calibri" w:hAnsi="Calibri"/>
-          <w:b/>
-          <w:bCs/>
-          <w:color w:val="7C3AED"/>
-          <w:sz w:val="36"/>
-          <w:szCs w:val="36"/>
-        </w:rPr>
-        <w:t xml:space="preserve">AI content writing glossary</w:t>
-      </w:r>
-    </w:p>
-    <w:p>
-      <w:pPr>
-        <w:spacing w:after="160"/>
-      </w:pPr>
-      <w:r>
-        <w:rPr>
-          <w:rFonts w:ascii="Calibri" w:cs="Calibri" w:eastAsia="Calibri" w:hAnsi="Calibri"/>
-          <w:b/>
-          <w:bCs/>
-          <w:color w:val="333333"/>
-          <w:sz w:val="24"/>
-          <w:szCs w:val="24"/>
-        </w:rPr>
-        <w:t xml:space="preserve">Large language model (LLM):</w:t>
-      </w:r>
-      <w:r>
-        <w:rPr>
-          <w:rFonts w:ascii="Calibri" w:cs="Calibri" w:eastAsia="Calibri" w:hAnsi="Calibri"/>
-          <w:color w:val="333333"/>
-          <w:sz w:val="24"/>
-          <w:szCs w:val="24"/>
-        </w:rPr>
-        <w:t xml:space="preserve"> the type of AI behind Claude, ChatGPT and Gemini. It generates text by predicting the next word from patterns in its training data.</w:t>
-      </w:r>
-    </w:p>
-    <w:p>
-      <w:pPr>
-        <w:spacing w:after="160"/>
-      </w:pPr>
-      <w:r>
-        <w:rPr>
-          <w:rFonts w:ascii="Calibri" w:cs="Calibri" w:eastAsia="Calibri" w:hAnsi="Calibri"/>
-          <w:b/>
-          <w:bCs/>
-          <w:color w:val="333333"/>
-          <w:sz w:val="24"/>
-          <w:szCs w:val="24"/>
-        </w:rPr>
-        <w:t xml:space="preserve">Prompt:</w:t>
-      </w:r>
-      <w:r>
-        <w:rPr>
-          <w:rFonts w:ascii="Calibri" w:cs="Calibri" w:eastAsia="Calibri" w:hAnsi="Calibri"/>
-          <w:color w:val="333333"/>
-          <w:sz w:val="24"/>
-          <w:szCs w:val="24"/>
-        </w:rPr>
-        <w:t xml:space="preserve"> the instruction you give an AI tool. A good prompt includes the goal, the reader, the format and the facts to use.</w:t>
-      </w:r>
-    </w:p>
-    <w:p>
-      <w:pPr>
-        <w:spacing w:after="160"/>
-      </w:pPr>
-      <w:r>
-        <w:rPr>
-          <w:rFonts w:ascii="Calibri" w:cs="Calibri" w:eastAsia="Calibri" w:hAnsi="Calibri"/>
-          <w:b/>
-          <w:bCs/>
-          <w:color w:val="333333"/>
-          <w:sz w:val="24"/>
-          <w:szCs w:val="24"/>
-        </w:rPr>
-        <w:t xml:space="preserve">Project or custom instructions:</w:t>
-      </w:r>
-      <w:r>
-        <w:rPr>
-          <w:rFonts w:ascii="Calibri" w:cs="Calibri" w:eastAsia="Calibri" w:hAnsi="Calibri"/>
-          <w:color w:val="333333"/>
-          <w:sz w:val="24"/>
-          <w:szCs w:val="24"/>
-        </w:rPr>
-        <w:t xml:space="preserve"> saved instructions an AI tool applies to every chat, such as your tone, audience and banned words.</w:t>
-      </w:r>
-    </w:p>
-    <w:p>
-      <w:pPr>
-        <w:spacing w:after="160"/>
-      </w:pPr>
-      <w:r>
-        <w:rPr>
-          <w:rFonts w:ascii="Calibri" w:cs="Calibri" w:eastAsia="Calibri" w:hAnsi="Calibri"/>
-          <w:b/>
-          <w:bCs/>
-          <w:color w:val="333333"/>
-          <w:sz w:val="24"/>
-          <w:szCs w:val="24"/>
-        </w:rPr>
-        <w:t xml:space="preserve">Hallucination:</w:t>
-      </w:r>
-      <w:r>
-        <w:rPr>
-          <w:rFonts w:ascii="Calibri" w:cs="Calibri" w:eastAsia="Calibri" w:hAnsi="Calibri"/>
-          <w:color w:val="333333"/>
-          <w:sz w:val="24"/>
-          <w:szCs w:val="24"/>
-        </w:rPr>
-        <w:t xml:space="preserve"> a confident but false statement produced by an AI, such as an invented statistic or source.</w:t>
-      </w:r>
-    </w:p>
-    <w:p>
-      <w:pPr>
-        <w:spacing w:after="160"/>
-      </w:pPr>
-      <w:r>
-        <w:rPr>
-          <w:rFonts w:ascii="Calibri" w:cs="Calibri" w:eastAsia="Calibri" w:hAnsi="Calibri"/>
-          <w:b/>
-          <w:bCs/>
-          <w:color w:val="333333"/>
-          <w:sz w:val="24"/>
-          <w:szCs w:val="24"/>
-        </w:rPr>
-        <w:t xml:space="preserve">Context window:</w:t>
-      </w:r>
-      <w:r>
-        <w:rPr>
-          <w:rFonts w:ascii="Calibri" w:cs="Calibri" w:eastAsia="Calibri" w:hAnsi="Calibri"/>
-          <w:color w:val="333333"/>
-          <w:sz w:val="24"/>
-          <w:szCs w:val="24"/>
-        </w:rPr>
-        <w:t xml:space="preserve"> how much text an AI can consider at once, including your instructions, files and the conversation so far.</w:t>
-      </w:r>
-    </w:p>
-    <w:p>
-      <w:pPr>
-        <w:spacing w:after="160"/>
-      </w:pPr>
-      <w:r>
-        <w:rPr>
-          <w:rFonts w:ascii="Calibri" w:cs="Calibri" w:eastAsia="Calibri" w:hAnsi="Calibri"/>
-          <w:b/>
-          <w:bCs/>
-          <w:color w:val="333333"/>
-          <w:sz w:val="24"/>
-          <w:szCs w:val="24"/>
-        </w:rPr>
-        <w:t xml:space="preserve">Humanizing:</w:t>
-      </w:r>
-      <w:r>
-        <w:rPr>
-          <w:rFonts w:ascii="Calibri" w:cs="Calibri" w:eastAsia="Calibri" w:hAnsi="Calibri"/>
-          <w:color w:val="333333"/>
-          <w:sz w:val="24"/>
-          <w:szCs w:val="24"/>
-        </w:rPr>
-        <w:t xml:space="preserve"> editing AI text so it reads naturally and carries real experience, not just swapping words.</w:t>
-      </w:r>
-    </w:p>
-    <w:p>
-      <w:pPr>
-        <w:spacing w:after="160"/>
-      </w:pPr>
-      <w:r>
-        <w:rPr>
-          <w:rFonts w:ascii="Calibri" w:cs="Calibri" w:eastAsia="Calibri" w:hAnsi="Calibri"/>
-          <w:b/>
-          <w:bCs/>
-          <w:color w:val="333333"/>
-          <w:sz w:val="24"/>
-          <w:szCs w:val="24"/>
-        </w:rPr>
-        <w:t xml:space="preserve">Information gain:</w:t>
-      </w:r>
-      <w:r>
-        <w:rPr>
-          <w:rFonts w:ascii="Calibri" w:cs="Calibri" w:eastAsia="Calibri" w:hAnsi="Calibri"/>
-          <w:color w:val="333333"/>
-          <w:sz w:val="24"/>
-          <w:szCs w:val="24"/>
-        </w:rPr>
-        <w:t xml:space="preserve"> what a page adds beyond what already ranks, such as original data, tests or first-hand examples.</w:t>
-      </w:r>
-    </w:p>
-    <w:p>
-      <w:pPr>
-        <w:spacing w:after="160"/>
-      </w:pPr>
-      <w:r>
-        <w:rPr>
-          <w:rFonts w:ascii="Calibri" w:cs="Calibri" w:eastAsia="Calibri" w:hAnsi="Calibri"/>
-          <w:b/>
-          <w:bCs/>
-          <w:color w:val="333333"/>
-          <w:sz w:val="24"/>
-          <w:szCs w:val="24"/>
-        </w:rPr>
-        <w:t xml:space="preserve">E-E-A-T:</w:t>
-      </w:r>
-      <w:r>
-        <w:rPr>
-          <w:rFonts w:ascii="Calibri" w:cs="Calibri" w:eastAsia="Calibri" w:hAnsi="Calibri"/>
-          <w:color w:val="333333"/>
-          <w:sz w:val="24"/>
-          <w:szCs w:val="24"/>
-        </w:rPr>
-        <w:t xml:space="preserve"> experience, expertise, authoritativeness and trustworthiness, the qualities Google's quality raters look for.</w:t>
-      </w:r>
-    </w:p>
-    <w:p>
-      <w:pPr>
-        <w:spacing w:after="160"/>
-      </w:pPr>
-      <w:r>
-        <w:rPr>
-          <w:rFonts w:ascii="Calibri" w:cs="Calibri" w:eastAsia="Calibri" w:hAnsi="Calibri"/>
-          <w:b/>
-          <w:bCs/>
-          <w:color w:val="333333"/>
-          <w:sz w:val="24"/>
-          <w:szCs w:val="24"/>
-        </w:rPr>
-        <w:t xml:space="preserve">Scaled content abuse:</w:t>
-      </w:r>
-      <w:r>
-        <w:rPr>
-          <w:rFonts w:ascii="Calibri" w:cs="Calibri" w:eastAsia="Calibri" w:hAnsi="Calibri"/>
-          <w:color w:val="333333"/>
-          <w:sz w:val="24"/>
-          <w:szCs w:val="24"/>
-        </w:rPr>
-        <w:t xml:space="preserve"> Google's spam policy against publishing many low-value pages to manipulate rankings, however they're produced.</w:t>
-      </w:r>
-    </w:p>
-    <w:p>
-      <w:pPr>
-        <w:spacing w:after="160"/>
-      </w:pPr>
-      <w:r>
-        <w:rPr>
-          <w:rFonts w:ascii="Calibri" w:cs="Calibri" w:eastAsia="Calibri" w:hAnsi="Calibri"/>
-          <w:b/>
-          <w:bCs/>
-          <w:color w:val="333333"/>
-          <w:sz w:val="24"/>
-          <w:szCs w:val="24"/>
-        </w:rPr>
-        <w:t xml:space="preserve">AEO and GEO:</w:t>
-      </w:r>
-      <w:r>
-        <w:rPr>
-          <w:rFonts w:ascii="Calibri" w:cs="Calibri" w:eastAsia="Calibri" w:hAnsi="Calibri"/>
-          <w:color w:val="333333"/>
-          <w:sz w:val="24"/>
-          <w:szCs w:val="24"/>
-        </w:rPr>
-        <w:t xml:space="preserve"> answer engine optimisation and generative engine optimisation, the practice of structuring content so AI answers and AI search features can quote it.</w:t>
-      </w:r>
-    </w:p>
-    <w:p>
-      <w:pPr>
-        <w:spacing w:after="160"/>
-      </w:pPr>
-      <w:r>
-        <w:rPr>
-          <w:rFonts w:ascii="Calibri" w:cs="Calibri" w:eastAsia="Calibri" w:hAnsi="Calibri"/>
-          <w:b/>
-          <w:bCs/>
-          <w:color w:val="333333"/>
-          <w:sz w:val="24"/>
-          <w:szCs w:val="24"/>
-        </w:rPr>
-        <w:t xml:space="preserve">AI detector:</w:t>
-      </w:r>
-      <w:r>
-        <w:rPr>
-          <w:rFonts w:ascii="Calibri" w:cs="Calibri" w:eastAsia="Calibri" w:hAnsi="Calibri"/>
-          <w:color w:val="333333"/>
-          <w:sz w:val="24"/>
-          <w:szCs w:val="24"/>
-        </w:rPr>
-        <w:t xml:space="preserve"> a tool that estimates whether text was machine-written. Useful for spotting AI-style sentences, but unable to prove authorship.</w:t>
-      </w:r>
-    </w:p>
-    <w:p>
-      <w:pPr>
-        <w:pStyle w:val="Heading2"/>
-        <w:spacing w:after="120" w:before="300"/>
-      </w:pPr>
-      <w:r>
-        <w:rPr>
-          <w:rFonts w:ascii="Calibri" w:cs="Calibri" w:eastAsia="Calibri" w:hAnsi="Calibri"/>
-          <w:b/>
-          <w:bCs/>
-          <w:color w:val="7C3AED"/>
-          <w:sz w:val="36"/>
-          <w:szCs w:val="36"/>
-        </w:rPr>
-        <w:t xml:space="preserve">Free tools for AI content writers</w:t>
-      </w:r>
-    </w:p>
-    <w:p>
-      <w:pPr>
-        <w:spacing w:after="160"/>
-      </w:pPr>
-      <w:r>
-        <w:rPr>
-          <w:rFonts w:ascii="Calibri" w:cs="Calibri" w:eastAsia="Calibri" w:hAnsi="Calibri"/>
-          <w:color w:val="333333"/>
-          <w:sz w:val="24"/>
-          <w:szCs w:val="24"/>
-        </w:rPr>
-        <w:t xml:space="preserve">These free BrightlyFuture tools cover the checking stages of the workflow. All run in your browser, with no sign-up.</w:t>
+        <w:t xml:space="preserve">Plagiarism by paraphrase.</w:t>
+      </w:r>
+      <w:r>
+        <w:rPr>
+          <w:rFonts w:ascii="Calibri" w:cs="Calibri" w:eastAsia="Calibri" w:hAnsi="Calibri"/>
+          <w:color w:val="333333"/>
+          <w:sz w:val="24"/>
+          <w:szCs w:val="24"/>
+        </w:rPr>
+        <w:t xml:space="preserve"> Asking AI to reword someone else's article doesn't make it yours. Google's spam policies treat swapping in synonyms and republishing as scraping.</w:t>
       </w:r>
     </w:p>
     <w:p>
@@ -3561,7 +3858,413 @@
           <w:numId w:val="1"/>
         </w:numPr>
       </w:pPr>
-      <w:hyperlink w:history="1" r:id="rIdq0aqetlit_zttqg61yjsv">
+      <w:r>
+        <w:rPr>
+          <w:rFonts w:ascii="Calibri" w:cs="Calibri" w:eastAsia="Calibri" w:hAnsi="Calibri"/>
+          <w:b/>
+          <w:bCs/>
+          <w:color w:val="333333"/>
+          <w:sz w:val="24"/>
+          <w:szCs w:val="24"/>
+        </w:rPr>
+        <w:t xml:space="preserve">Privacy.</w:t>
+      </w:r>
+      <w:r>
+        <w:rPr>
+          <w:rFonts w:ascii="Calibri" w:cs="Calibri" w:eastAsia="Calibri" w:hAnsi="Calibri"/>
+          <w:color w:val="333333"/>
+          <w:sz w:val="24"/>
+          <w:szCs w:val="24"/>
+        </w:rPr>
+        <w:t xml:space="preserve"> Don't paste customer data or confidential documents into AI tools unless your data protection obligations (such as GDPR) and your provider's terms allow it.</w:t>
+      </w:r>
+    </w:p>
+    <w:p>
+      <w:pPr>
+        <w:pStyle w:val="ListParagraph"/>
+        <w:numPr>
+          <w:ilvl w:val="0"/>
+          <w:numId w:val="1"/>
+        </w:numPr>
+      </w:pPr>
+      <w:r>
+        <w:rPr>
+          <w:rFonts w:ascii="Calibri" w:cs="Calibri" w:eastAsia="Calibri" w:hAnsi="Calibri"/>
+          <w:b/>
+          <w:bCs/>
+          <w:color w:val="333333"/>
+          <w:sz w:val="24"/>
+          <w:szCs w:val="24"/>
+        </w:rPr>
+        <w:t xml:space="preserve">Scale without review.</w:t>
+      </w:r>
+      <w:r>
+        <w:rPr>
+          <w:rFonts w:ascii="Calibri" w:cs="Calibri" w:eastAsia="Calibri" w:hAnsi="Calibri"/>
+          <w:color w:val="333333"/>
+          <w:sz w:val="24"/>
+          <w:szCs w:val="24"/>
+        </w:rPr>
+        <w:t xml:space="preserve"> Publishing faster than you can check is how sites end up with the low-value pages Google's spam updates target.</w:t>
+      </w:r>
+    </w:p>
+    <w:p>
+      <w:pPr>
+        <w:pStyle w:val="Heading2"/>
+        <w:spacing w:after="120" w:before="300"/>
+      </w:pPr>
+      <w:r>
+        <w:rPr>
+          <w:rFonts w:ascii="Calibri" w:cs="Calibri" w:eastAsia="Calibri" w:hAnsi="Calibri"/>
+          <w:b/>
+          <w:bCs/>
+          <w:color w:val="7C3AED"/>
+          <w:sz w:val="36"/>
+          <w:szCs w:val="36"/>
+        </w:rPr>
+        <w:t xml:space="preserve">AI content writing glossary</w:t>
+      </w:r>
+    </w:p>
+    <w:p>
+      <w:pPr>
+        <w:spacing w:after="160"/>
+      </w:pPr>
+      <w:r>
+        <w:rPr>
+          <w:rFonts w:ascii="Calibri" w:cs="Calibri" w:eastAsia="Calibri" w:hAnsi="Calibri"/>
+          <w:b/>
+          <w:bCs/>
+          <w:color w:val="333333"/>
+          <w:sz w:val="24"/>
+          <w:szCs w:val="24"/>
+        </w:rPr>
+        <w:t xml:space="preserve">Large language model (LLM):</w:t>
+      </w:r>
+      <w:r>
+        <w:rPr>
+          <w:rFonts w:ascii="Calibri" w:cs="Calibri" w:eastAsia="Calibri" w:hAnsi="Calibri"/>
+          <w:color w:val="333333"/>
+          <w:sz w:val="24"/>
+          <w:szCs w:val="24"/>
+        </w:rPr>
+        <w:t xml:space="preserve"> the type of AI behind Claude, ChatGPT and Gemini. It generates text by predicting the next word from patterns in its training data.</w:t>
+      </w:r>
+    </w:p>
+    <w:p>
+      <w:pPr>
+        <w:spacing w:after="160"/>
+      </w:pPr>
+      <w:r>
+        <w:rPr>
+          <w:rFonts w:ascii="Calibri" w:cs="Calibri" w:eastAsia="Calibri" w:hAnsi="Calibri"/>
+          <w:b/>
+          <w:bCs/>
+          <w:color w:val="333333"/>
+          <w:sz w:val="24"/>
+          <w:szCs w:val="24"/>
+        </w:rPr>
+        <w:t xml:space="preserve">Prompt:</w:t>
+      </w:r>
+      <w:r>
+        <w:rPr>
+          <w:rFonts w:ascii="Calibri" w:cs="Calibri" w:eastAsia="Calibri" w:hAnsi="Calibri"/>
+          <w:color w:val="333333"/>
+          <w:sz w:val="24"/>
+          <w:szCs w:val="24"/>
+        </w:rPr>
+        <w:t xml:space="preserve"> the instruction you give an AI tool. A good prompt includes the goal, the reader, the format and the facts to use.</w:t>
+      </w:r>
+    </w:p>
+    <w:p>
+      <w:pPr>
+        <w:spacing w:after="160"/>
+      </w:pPr>
+      <w:r>
+        <w:rPr>
+          <w:rFonts w:ascii="Calibri" w:cs="Calibri" w:eastAsia="Calibri" w:hAnsi="Calibri"/>
+          <w:b/>
+          <w:bCs/>
+          <w:color w:val="333333"/>
+          <w:sz w:val="24"/>
+          <w:szCs w:val="24"/>
+        </w:rPr>
+        <w:t xml:space="preserve">Project or custom instructions:</w:t>
+      </w:r>
+      <w:r>
+        <w:rPr>
+          <w:rFonts w:ascii="Calibri" w:cs="Calibri" w:eastAsia="Calibri" w:hAnsi="Calibri"/>
+          <w:color w:val="333333"/>
+          <w:sz w:val="24"/>
+          <w:szCs w:val="24"/>
+        </w:rPr>
+        <w:t xml:space="preserve"> saved instructions an AI tool applies to all your chats, such as your tone, audience and banned words.</w:t>
+      </w:r>
+    </w:p>
+    <w:p>
+      <w:pPr>
+        <w:spacing w:after="160"/>
+      </w:pPr>
+      <w:r>
+        <w:rPr>
+          <w:rFonts w:ascii="Calibri" w:cs="Calibri" w:eastAsia="Calibri" w:hAnsi="Calibri"/>
+          <w:b/>
+          <w:bCs/>
+          <w:color w:val="333333"/>
+          <w:sz w:val="24"/>
+          <w:szCs w:val="24"/>
+        </w:rPr>
+        <w:t xml:space="preserve">Grounding:</w:t>
+      </w:r>
+      <w:r>
+        <w:rPr>
+          <w:rFonts w:ascii="Calibri" w:cs="Calibri" w:eastAsia="Calibri" w:hAnsi="Calibri"/>
+          <w:color w:val="333333"/>
+          <w:sz w:val="24"/>
+          <w:szCs w:val="24"/>
+        </w:rPr>
+        <w:t xml:space="preserve"> giving an AI your own sources to work from, so its answer draws on real material instead of guesses.</w:t>
+      </w:r>
+    </w:p>
+    <w:p>
+      <w:pPr>
+        <w:spacing w:after="160"/>
+      </w:pPr>
+      <w:r>
+        <w:rPr>
+          <w:rFonts w:ascii="Calibri" w:cs="Calibri" w:eastAsia="Calibri" w:hAnsi="Calibri"/>
+          <w:b/>
+          <w:bCs/>
+          <w:color w:val="333333"/>
+          <w:sz w:val="24"/>
+          <w:szCs w:val="24"/>
+        </w:rPr>
+        <w:t xml:space="preserve">Hallucination:</w:t>
+      </w:r>
+      <w:r>
+        <w:rPr>
+          <w:rFonts w:ascii="Calibri" w:cs="Calibri" w:eastAsia="Calibri" w:hAnsi="Calibri"/>
+          <w:color w:val="333333"/>
+          <w:sz w:val="24"/>
+          <w:szCs w:val="24"/>
+        </w:rPr>
+        <w:t xml:space="preserve"> a confident but false statement produced by an AI, such as an invented statistic or source.</w:t>
+      </w:r>
+    </w:p>
+    <w:p>
+      <w:pPr>
+        <w:spacing w:after="160"/>
+      </w:pPr>
+      <w:r>
+        <w:rPr>
+          <w:rFonts w:ascii="Calibri" w:cs="Calibri" w:eastAsia="Calibri" w:hAnsi="Calibri"/>
+          <w:b/>
+          <w:bCs/>
+          <w:color w:val="333333"/>
+          <w:sz w:val="24"/>
+          <w:szCs w:val="24"/>
+        </w:rPr>
+        <w:t xml:space="preserve">Context window:</w:t>
+      </w:r>
+      <w:r>
+        <w:rPr>
+          <w:rFonts w:ascii="Calibri" w:cs="Calibri" w:eastAsia="Calibri" w:hAnsi="Calibri"/>
+          <w:color w:val="333333"/>
+          <w:sz w:val="24"/>
+          <w:szCs w:val="24"/>
+        </w:rPr>
+        <w:t xml:space="preserve"> how much text an AI can consider at once, including your instructions, files and the conversation so far.</w:t>
+      </w:r>
+    </w:p>
+    <w:p>
+      <w:pPr>
+        <w:spacing w:after="160"/>
+      </w:pPr>
+      <w:r>
+        <w:rPr>
+          <w:rFonts w:ascii="Calibri" w:cs="Calibri" w:eastAsia="Calibri" w:hAnsi="Calibri"/>
+          <w:b/>
+          <w:bCs/>
+          <w:color w:val="333333"/>
+          <w:sz w:val="24"/>
+          <w:szCs w:val="24"/>
+        </w:rPr>
+        <w:t xml:space="preserve">Humanizing:</w:t>
+      </w:r>
+      <w:r>
+        <w:rPr>
+          <w:rFonts w:ascii="Calibri" w:cs="Calibri" w:eastAsia="Calibri" w:hAnsi="Calibri"/>
+          <w:color w:val="333333"/>
+          <w:sz w:val="24"/>
+          <w:szCs w:val="24"/>
+        </w:rPr>
+        <w:t xml:space="preserve"> editing AI text so it reads naturally and carries real experience, not just swapping words.</w:t>
+      </w:r>
+    </w:p>
+    <w:p>
+      <w:pPr>
+        <w:spacing w:after="160"/>
+      </w:pPr>
+      <w:r>
+        <w:rPr>
+          <w:rFonts w:ascii="Calibri" w:cs="Calibri" w:eastAsia="Calibri" w:hAnsi="Calibri"/>
+          <w:b/>
+          <w:bCs/>
+          <w:color w:val="333333"/>
+          <w:sz w:val="24"/>
+          <w:szCs w:val="24"/>
+        </w:rPr>
+        <w:t xml:space="preserve">Information gain:</w:t>
+      </w:r>
+      <w:r>
+        <w:rPr>
+          <w:rFonts w:ascii="Calibri" w:cs="Calibri" w:eastAsia="Calibri" w:hAnsi="Calibri"/>
+          <w:color w:val="333333"/>
+          <w:sz w:val="24"/>
+          <w:szCs w:val="24"/>
+        </w:rPr>
+        <w:t xml:space="preserve"> what a page adds beyond what already ranks, such as original data, tests or examples from your own work.</w:t>
+      </w:r>
+    </w:p>
+    <w:p>
+      <w:pPr>
+        <w:spacing w:after="160"/>
+      </w:pPr>
+      <w:r>
+        <w:rPr>
+          <w:rFonts w:ascii="Calibri" w:cs="Calibri" w:eastAsia="Calibri" w:hAnsi="Calibri"/>
+          <w:b/>
+          <w:bCs/>
+          <w:color w:val="333333"/>
+          <w:sz w:val="24"/>
+          <w:szCs w:val="24"/>
+        </w:rPr>
+        <w:t xml:space="preserve">E-E-A-T:</w:t>
+      </w:r>
+      <w:r>
+        <w:rPr>
+          <w:rFonts w:ascii="Calibri" w:cs="Calibri" w:eastAsia="Calibri" w:hAnsi="Calibri"/>
+          <w:color w:val="333333"/>
+          <w:sz w:val="24"/>
+          <w:szCs w:val="24"/>
+        </w:rPr>
+        <w:t xml:space="preserve"> experience, expertise, authoritativeness and trustworthiness, the qualities Google's quality raters look for.</w:t>
+      </w:r>
+    </w:p>
+    <w:p>
+      <w:pPr>
+        <w:spacing w:after="160"/>
+      </w:pPr>
+      <w:r>
+        <w:rPr>
+          <w:rFonts w:ascii="Calibri" w:cs="Calibri" w:eastAsia="Calibri" w:hAnsi="Calibri"/>
+          <w:b/>
+          <w:bCs/>
+          <w:color w:val="333333"/>
+          <w:sz w:val="24"/>
+          <w:szCs w:val="24"/>
+        </w:rPr>
+        <w:t xml:space="preserve">Scaled content abuse:</w:t>
+      </w:r>
+      <w:r>
+        <w:rPr>
+          <w:rFonts w:ascii="Calibri" w:cs="Calibri" w:eastAsia="Calibri" w:hAnsi="Calibri"/>
+          <w:color w:val="333333"/>
+          <w:sz w:val="24"/>
+          <w:szCs w:val="24"/>
+        </w:rPr>
+        <w:t xml:space="preserve"> Google's spam policy against publishing many low-value pages to manipulate rankings, however they're produced.</w:t>
+      </w:r>
+    </w:p>
+    <w:p>
+      <w:pPr>
+        <w:spacing w:after="160"/>
+      </w:pPr>
+      <w:r>
+        <w:rPr>
+          <w:rFonts w:ascii="Calibri" w:cs="Calibri" w:eastAsia="Calibri" w:hAnsi="Calibri"/>
+          <w:b/>
+          <w:bCs/>
+          <w:color w:val="333333"/>
+          <w:sz w:val="24"/>
+          <w:szCs w:val="24"/>
+        </w:rPr>
+        <w:t xml:space="preserve">AEO and GEO:</w:t>
+      </w:r>
+      <w:r>
+        <w:rPr>
+          <w:rFonts w:ascii="Calibri" w:cs="Calibri" w:eastAsia="Calibri" w:hAnsi="Calibri"/>
+          <w:color w:val="333333"/>
+          <w:sz w:val="24"/>
+          <w:szCs w:val="24"/>
+        </w:rPr>
+        <w:t xml:space="preserve"> answer engine optimisation and generative engine optimisation, the practice of structuring content so AI answers and AI search features can quote it.</w:t>
+      </w:r>
+    </w:p>
+    <w:p>
+      <w:pPr>
+        <w:spacing w:after="160"/>
+      </w:pPr>
+      <w:r>
+        <w:rPr>
+          <w:rFonts w:ascii="Calibri" w:cs="Calibri" w:eastAsia="Calibri" w:hAnsi="Calibri"/>
+          <w:b/>
+          <w:bCs/>
+          <w:color w:val="333333"/>
+          <w:sz w:val="24"/>
+          <w:szCs w:val="24"/>
+        </w:rPr>
+        <w:t xml:space="preserve">AI detector:</w:t>
+      </w:r>
+      <w:r>
+        <w:rPr>
+          <w:rFonts w:ascii="Calibri" w:cs="Calibri" w:eastAsia="Calibri" w:hAnsi="Calibri"/>
+          <w:color w:val="333333"/>
+          <w:sz w:val="24"/>
+          <w:szCs w:val="24"/>
+        </w:rPr>
+        <w:t xml:space="preserve"> a tool that estimates whether text was machine-written. Useful for spotting AI-style sentences, but unable to prove authorship.</w:t>
+      </w:r>
+    </w:p>
+    <w:p>
+      <w:pPr>
+        <w:pStyle w:val="Heading2"/>
+        <w:spacing w:after="120" w:before="300"/>
+      </w:pPr>
+      <w:r>
+        <w:rPr>
+          <w:rFonts w:ascii="Calibri" w:cs="Calibri" w:eastAsia="Calibri" w:hAnsi="Calibri"/>
+          <w:b/>
+          <w:bCs/>
+          <w:color w:val="7C3AED"/>
+          <w:sz w:val="36"/>
+          <w:szCs w:val="36"/>
+        </w:rPr>
+        <w:t xml:space="preserve">Free tools for AI content writers</w:t>
+      </w:r>
+    </w:p>
+    <w:p>
+      <w:pPr>
+        <w:spacing w:after="160"/>
+      </w:pPr>
+      <w:r>
+        <w:rPr>
+          <w:rFonts w:ascii="Calibri" w:cs="Calibri" w:eastAsia="Calibri" w:hAnsi="Calibri"/>
+          <w:color w:val="333333"/>
+          <w:sz w:val="24"/>
+          <w:szCs w:val="24"/>
+        </w:rPr>
+        <w:t xml:space="preserve">These free BrightlyFuture tools cover the checking stages of the workflow, with no sign-up.</w:t>
+      </w:r>
+    </w:p>
+    <w:p>
+      <w:pPr>
+        <w:pStyle w:val="ListParagraph"/>
+        <w:numPr>
+          <w:ilvl w:val="0"/>
+          <w:numId w:val="1"/>
+        </w:numPr>
+      </w:pPr>
+      <w:hyperlink w:history="1" r:id="rIdch4bytl9ptlibfc5pajnt">
         <w:r>
           <w:rPr>
             <w:rStyle w:val="Hyperlink"/>
@@ -3581,7 +4284,7 @@
           <w:sz w:val="24"/>
           <w:szCs w:val="24"/>
         </w:rPr>
-        <w:t xml:space="preserve"> – generate a first draft from a topic.</w:t>
+        <w:t xml:space="preserve"> – get a structured first draft from a topic and your notes.</w:t>
       </w:r>
     </w:p>
     <w:p>
@@ -3592,7 +4295,7 @@
           <w:numId w:val="1"/>
         </w:numPr>
       </w:pPr>
-      <w:hyperlink w:history="1" r:id="rIdpj5okkkxsjh9b6hpwn0jl">
+      <w:hyperlink w:history="1" r:id="rIdys0cbcnbxjulkgoj2u0uy">
         <w:r>
           <w:rPr>
             <w:rStyle w:val="Hyperlink"/>
@@ -3612,7 +4315,7 @@
           <w:sz w:val="24"/>
           <w:szCs w:val="24"/>
         </w:rPr>
-        <w:t xml:space="preserve"> – rewrite sentences and see how many phrases still match the original.</w:t>
+        <w:t xml:space="preserve"> – rewrite sentences in six tones and see how many phrases still match the original.</w:t>
       </w:r>
     </w:p>
     <w:p>
@@ -3623,7 +4326,7 @@
           <w:numId w:val="1"/>
         </w:numPr>
       </w:pPr>
-      <w:hyperlink w:history="1" r:id="rId1ajnnmhfithpnk23w26ic">
+      <w:hyperlink w:history="1" r:id="rIdftvz9exfjn2iydzelisgt">
         <w:r>
           <w:rPr>
             <w:rStyle w:val="Hyperlink"/>
@@ -3633,7 +4336,7 @@
             <w:szCs w:val="24"/>
             <w:u w:val="single"/>
           </w:rPr>
-          <w:t xml:space="preserve">AI Writing Checker</w:t>
+          <w:t xml:space="preserve">AI Content Detector</w:t>
         </w:r>
       </w:hyperlink>
       <w:r>
@@ -3643,7 +4346,7 @@
           <w:sz w:val="24"/>
           <w:szCs w:val="24"/>
         </w:rPr>
-        <w:t xml:space="preserve"> – find sentences that read like unedited AI.</w:t>
+        <w:t xml:space="preserve"> – find sentences that read like unedited AI, and why.</w:t>
       </w:r>
     </w:p>
     <w:p>
@@ -3654,7 +4357,7 @@
           <w:numId w:val="1"/>
         </w:numPr>
       </w:pPr>
-      <w:hyperlink w:history="1" r:id="rId8cixe1q6p2pgtx8vuurpq">
+      <w:hyperlink w:history="1" r:id="rIdt3vg4356zilcwnrlnhr2p">
         <w:r>
           <w:rPr>
             <w:rStyle w:val="Hyperlink"/>
@@ -3674,7 +4377,7 @@
           <w:sz w:val="24"/>
           <w:szCs w:val="24"/>
         </w:rPr>
-        <w:t xml:space="preserve"> – get Flesch, grade level and the sentences to fix.</w:t>
+        <w:t xml:space="preserve"> – get your Flesch score, grade level and the sentences to fix.</w:t>
       </w:r>
     </w:p>
     <w:p>
@@ -3685,7 +4388,7 @@
           <w:numId w:val="1"/>
         </w:numPr>
       </w:pPr>
-      <w:hyperlink w:history="1" r:id="rIdliqnvgbuagxcknhw63g-q">
+      <w:hyperlink w:history="1" r:id="rIds52dkmottspyu2e-8m_0h">
         <w:r>
           <w:rPr>
             <w:rStyle w:val="Hyperlink"/>
@@ -3705,7 +4408,7 @@
           <w:sz w:val="24"/>
           <w:szCs w:val="24"/>
         </w:rPr>
-        <w:t xml:space="preserve"> – check title length, keyword position and truncation.</w:t>
+        <w:t xml:space="preserve"> – check title length, keyword position and how it looks in Google.</w:t>
       </w:r>
     </w:p>
     <w:p>
@@ -3716,7 +4419,7 @@
           <w:numId w:val="1"/>
         </w:numPr>
       </w:pPr>
-      <w:hyperlink w:history="1" r:id="rIdixkesxg-3g5owbbbogsxh">
+      <w:hyperlink w:history="1" r:id="rIdfc-rsipsb9yobchsajg8h">
         <w:r>
           <w:rPr>
             <w:rStyle w:val="Hyperlink"/>
@@ -3752,7 +4455,7 @@
         </w:rPr>
         <w:t xml:space="preserve">If you'd rather have the writing done for you, our </w:t>
       </w:r>
-      <w:hyperlink w:history="1" r:id="rIdputqfioezliuzziszzsj7">
+      <w:hyperlink w:history="1" r:id="rIdffeyj6aoxkng-bafl_j4h">
         <w:r>
           <w:rPr>
             <w:rStyle w:val="Hyperlink"/>
@@ -3868,21 +4571,43 @@
           <w:sz w:val="28"/>
           <w:szCs w:val="28"/>
         </w:rPr>
-        <w:t xml:space="preserve">What skills do you need to be good at AI content writing?</w:t>
-      </w:r>
-    </w:p>
-    <w:p>
-      <w:pPr>
-        <w:spacing w:after="160"/>
-      </w:pPr>
-      <w:r>
-        <w:rPr>
-          <w:rFonts w:ascii="Calibri" w:cs="Calibri" w:eastAsia="Calibri" w:hAnsi="Calibri"/>
-          <w:color w:val="333333"/>
-          <w:sz w:val="24"/>
-          <w:szCs w:val="24"/>
-        </w:rPr>
-        <w:t xml:space="preserve">The most useful skills are the editorial ones: knowing your reader, writing a clear brief, spotting weak or false claims, and editing for voice. Prompting matters less than most people think. A writer who knows the subject and checks facts will get better results from any tool than an expert prompter who doesn't.</w:t>
+        <w:t xml:space="preserve">Who owns the copyright in AI-written content?</w:t>
+      </w:r>
+    </w:p>
+    <w:p>
+      <w:pPr>
+        <w:spacing w:after="160"/>
+      </w:pPr>
+      <w:r>
+        <w:rPr>
+          <w:rFonts w:ascii="Calibri" w:cs="Calibri" w:eastAsia="Calibri" w:hAnsi="Calibri"/>
+          <w:color w:val="333333"/>
+          <w:sz w:val="24"/>
+          <w:szCs w:val="24"/>
+        </w:rPr>
+        <w:t xml:space="preserve">It depends on how much of it is yours. In its January 2025 report, the </w:t>
+      </w:r>
+      <w:hyperlink w:history="1" r:id="rIdoxf80fe8zcdiefomf12mb">
+        <w:r>
+          <w:rPr>
+            <w:rStyle w:val="Hyperlink"/>
+            <w:rFonts w:ascii="Calibri" w:cs="Calibri" w:eastAsia="Calibri" w:hAnsi="Calibri"/>
+            <w:color w:val="0563C1"/>
+            <w:sz w:val="24"/>
+            <w:szCs w:val="24"/>
+            <w:u w:val="single"/>
+          </w:rPr>
+          <w:t xml:space="preserve">US Copyright Office</w:t>
+        </w:r>
+      </w:hyperlink>
+      <w:r>
+        <w:rPr>
+          <w:rFonts w:ascii="Calibri" w:cs="Calibri" w:eastAsia="Calibri" w:hAnsi="Calibri"/>
+          <w:color w:val="333333"/>
+          <w:sz w:val="24"/>
+          <w:szCs w:val="24"/>
+        </w:rPr>
+        <w:t xml:space="preserve"> concluded that prompts alone don't make you the author, but your own writing, creative selection and substantial edits can be protected. Rules differ by country, so treat heavily edited work as safer than raw output.</w:t>
       </w:r>
     </w:p>
     <w:p>
@@ -3899,21 +4624,96 @@
           <w:sz w:val="28"/>
           <w:szCs w:val="28"/>
         </w:rPr>
-        <w:t xml:space="preserve">How do you keep AI content consistent across a team?</w:t>
-      </w:r>
-    </w:p>
-    <w:p>
-      <w:pPr>
-        <w:spacing w:after="160"/>
-      </w:pPr>
-      <w:r>
-        <w:rPr>
-          <w:rFonts w:ascii="Calibri" w:cs="Calibri" w:eastAsia="Calibri" w:hAnsi="Calibri"/>
-          <w:color w:val="333333"/>
-          <w:sz w:val="24"/>
-          <w:szCs w:val="24"/>
-        </w:rPr>
-        <w:t xml:space="preserve">Agree one brief template, one list of tone rules and banned phrases, and one editor who approves everything before publishing. Store the instructions somewhere every writer uses, such as a shared Claude Project on Team plans or a shared document, so every draft starts from the same rules.</w:t>
+        <w:t xml:space="preserve">What skills do you need to be good at AI content writing?</w:t>
+      </w:r>
+    </w:p>
+    <w:p>
+      <w:pPr>
+        <w:spacing w:after="160"/>
+      </w:pPr>
+      <w:r>
+        <w:rPr>
+          <w:rFonts w:ascii="Calibri" w:cs="Calibri" w:eastAsia="Calibri" w:hAnsi="Calibri"/>
+          <w:color w:val="333333"/>
+          <w:sz w:val="24"/>
+          <w:szCs w:val="24"/>
+        </w:rPr>
+        <w:t xml:space="preserve">The most useful skills are editorial: knowing your reader, writing a clear brief, spotting weak or false claims, and editing for voice. Prompting matters less than most people think. A writer who knows the subject and checks facts will get better results from any tool than an expert prompter who doesn't.</w:t>
+      </w:r>
+    </w:p>
+    <w:p>
+      <w:pPr>
+        <w:pStyle w:val="Heading3"/>
+        <w:spacing w:after="80" w:before="200"/>
+      </w:pPr>
+      <w:r>
+        <w:rPr>
+          <w:rFonts w:ascii="Calibri" w:cs="Calibri" w:eastAsia="Calibri" w:hAnsi="Calibri"/>
+          <w:b/>
+          <w:bCs/>
+          <w:color w:val="333333"/>
+          <w:sz w:val="28"/>
+          <w:szCs w:val="28"/>
+        </w:rPr>
+        <w:t xml:space="preserve">Can AI-assisted content be cited by ChatGPT and Perplexity?</w:t>
+      </w:r>
+    </w:p>
+    <w:p>
+      <w:pPr>
+        <w:spacing w:after="160"/>
+      </w:pPr>
+      <w:r>
+        <w:rPr>
+          <w:rFonts w:ascii="Calibri" w:cs="Calibri" w:eastAsia="Calibri" w:hAnsi="Calibri"/>
+          <w:color w:val="333333"/>
+          <w:sz w:val="24"/>
+          <w:szCs w:val="24"/>
+        </w:rPr>
+        <w:t xml:space="preserve">Yes, if their search crawlers can reach it. ChatGPT search uses </w:t>
+      </w:r>
+      <w:hyperlink w:history="1" r:id="rIdw-tvide8i_irjch1yppvn">
+        <w:r>
+          <w:rPr>
+            <w:rStyle w:val="Hyperlink"/>
+            <w:rFonts w:ascii="Calibri" w:cs="Calibri" w:eastAsia="Calibri" w:hAnsi="Calibri"/>
+            <w:color w:val="0563C1"/>
+            <w:sz w:val="24"/>
+            <w:szCs w:val="24"/>
+            <w:u w:val="single"/>
+          </w:rPr>
+          <w:t xml:space="preserve">OAI-SearchBot</w:t>
+        </w:r>
+      </w:hyperlink>
+      <w:r>
+        <w:rPr>
+          <w:rFonts w:ascii="Calibri" w:cs="Calibri" w:eastAsia="Calibri" w:hAnsi="Calibri"/>
+          <w:color w:val="333333"/>
+          <w:sz w:val="24"/>
+          <w:szCs w:val="24"/>
+        </w:rPr>
+        <w:t xml:space="preserve"> and Perplexity uses </w:t>
+      </w:r>
+      <w:hyperlink w:history="1" r:id="rIdeoxzolg_gdf-q_4xpybfn">
+        <w:r>
+          <w:rPr>
+            <w:rStyle w:val="Hyperlink"/>
+            <w:rFonts w:ascii="Calibri" w:cs="Calibri" w:eastAsia="Calibri" w:hAnsi="Calibri"/>
+            <w:color w:val="0563C1"/>
+            <w:sz w:val="24"/>
+            <w:szCs w:val="24"/>
+            <w:u w:val="single"/>
+          </w:rPr>
+          <w:t xml:space="preserve">PerplexityBot</w:t>
+        </w:r>
+      </w:hyperlink>
+      <w:r>
+        <w:rPr>
+          <w:rFonts w:ascii="Calibri" w:cs="Calibri" w:eastAsia="Calibri" w:hAnsi="Calibri"/>
+          <w:color w:val="333333"/>
+          <w:sz w:val="24"/>
+          <w:szCs w:val="24"/>
+        </w:rPr>
+        <w:t xml:space="preserve">; blocking either in robots.txt keeps your pages out of that tool's answers. Blocking GPTBot only stops OpenAI training on your content; it doesn't affect ChatGPT search.</w:t>
       </w:r>
     </w:p>
     <w:p>
@@ -3960,7 +4760,7 @@
         </w:rPr>
         <w:t xml:space="preserve">Start with the part of the process you need most: the </w:t>
       </w:r>
-      <w:hyperlink w:history="1" r:id="rIdrlslfuxrm5zpbnesojbgg">
+      <w:hyperlink w:history="1" r:id="rIdkypapszeqenuz2-5kmvpb">
         <w:r>
           <w:rPr>
             <w:rStyle w:val="Hyperlink"/>
@@ -3982,7 +4782,7 @@
         </w:rPr>
         <w:t xml:space="preserve"> if you're new, the </w:t>
       </w:r>
-      <w:hyperlink w:history="1" r:id="rIdmbf7mifjus_9kldh1rhdc">
+      <w:hyperlink w:history="1" r:id="rId19nrt1jgztrlzxgf9cwrz">
         <w:r>
           <w:rPr>
             <w:rStyle w:val="Hyperlink"/>
@@ -4004,7 +4804,7 @@
         </w:rPr>
         <w:t xml:space="preserve"> if your drafts sound robotic, or </w:t>
       </w:r>
-      <w:hyperlink w:history="1" r:id="rId_vo9_pvfj0ekvq3zgwtnh">
+      <w:hyperlink w:history="1" r:id="rIddxkfujcrcprn_dwhxnwpc">
         <w:r>
           <w:rPr>
             <w:rStyle w:val="Hyperlink"/>

</xml_diff>